<commit_message>
fix: template PKS memakai placeholder dan pemisah halaman
</commit_message>
<xml_diff>
--- a/backend/internal/assets/templates/pks-template/Draft-PKS-RIU.docx
+++ b/backend/internal/assets/templates/pks-template/Draft-PKS-RIU.docx
@@ -136,7 +136,7 @@
           <w:b/>
           <w:highlight w:val="yellow"/>
         </w:rPr>
-        <w:t>____________</w:t>
+        <w:t>{{PIHAK_KEDUA_NAMA}}</w:t>
       </w:r>
     </w:p>
     <w:p>
@@ -171,7 +171,7 @@
           <w:b/>
           <w:highlight w:val="yellow"/>
         </w:rPr>
-        <w:t>____________</w:t>
+        <w:t>{{JENIS_PEKERJAAN}}</w:t>
       </w:r>
     </w:p>
     <w:p>
@@ -268,13 +268,13 @@
               <w:rPr>
                 <w:rFonts w:ascii="Calibri Light" w:eastAsia="Calibri" w:hAnsi="Calibri Light" w:cs="Calibri Light"/>
               </w:rPr>
-              <w:t>***/RM.01.01/**/IndonesiaRe/**/202</w:t>
+              <w:t>{{NOMOR_PIHAK_PERTAMA}}</w:t>
             </w:r>
             <w:r>
               <w:rPr>
                 <w:rFonts w:ascii="Calibri Light" w:eastAsia="Calibri" w:hAnsi="Calibri Light" w:cs="Calibri Light"/>
               </w:rPr>
-              <w:t>6</w:t>
+              <w:t/>
             </w:r>
           </w:p>
         </w:tc>
@@ -319,6 +319,9 @@
                 <w:rFonts w:ascii="Calibri Light" w:eastAsia="Calibri" w:hAnsi="Calibri Light" w:cs="Calibri Light"/>
               </w:rPr>
             </w:pPr>
+            <w:r>
+              <w:t>{{NOMOR_PIHAK_KEDUA}}</w:t>
+            </w:r>
           </w:p>
         </w:tc>
       </w:tr>
@@ -346,13 +349,13 @@
           <w:rFonts w:ascii="Calibri Light" w:eastAsia="Calibri" w:hAnsi="Calibri Light" w:cs="Calibri Light"/>
           <w:color w:val="000000"/>
         </w:rPr>
-        <w:t>Pada hari ini</w:t>
-      </w:r>
-      <w:r>
-        <w:rPr>
-          <w:rFonts w:ascii="Calibri Light" w:eastAsia="Calibri" w:hAnsi="Calibri Light" w:cs="Calibri Light"/>
-        </w:rPr>
-        <w:t xml:space="preserve">, [*], tanggal [*] bulan [*] tahun [*] (dd/mm/yyyy) bertempat di [*] </w:t>
+        <w:t>Pada hari ini, {{HARI_TTD}}, tanggal {{TANGGAL_TTD}} bulan {{BULAN_TTD}} tahun {{TAHUN_TTD}} ({{TANGGAL_TTD_LENGKAP}}) bertempat di {{TEMPAT_TTD}}</w:t>
+      </w:r>
+      <w:r>
+        <w:rPr>
+          <w:rFonts w:ascii="Calibri Light" w:eastAsia="Calibri" w:hAnsi="Calibri Light" w:cs="Calibri Light"/>
+        </w:rPr>
+        <w:t xml:space="preserve"> </w:t>
       </w:r>
       <w:r>
         <w:rPr>
@@ -399,27 +402,27 @@
         <w:rPr>
           <w:rFonts w:ascii="Calibri Light" w:eastAsia="Calibri" w:hAnsi="Calibri Light" w:cs="Calibri Light"/>
         </w:rPr>
-        <w:t xml:space="preserve">, suatu perseroan terbatas yang didirikan dan dijalankan berdasarkan hukum Negara Republik Indonesia, berkedudukan dan beralamat kantor di Jalan Salemba Raya Nomor 30, Jakarta Pusat, dalam hal ini diwakili oleh </w:t>
+        <w:t xml:space="preserve">, suatu perseroan terbatas yang didirikan dan dijalankan berdasarkan hukum Negara Republik Indonesia, berkedudukan dan beralamat kantor di {{PIHAK_PERTAMA_ALAMAT}}, dalam hal ini diwakili oleh {{PIHAK_PERTAMA_PEJABAT}}, selaku {{PIHAK_PERTAMA_JABATAN}}</w:t>
       </w:r>
       <w:r>
         <w:rPr>
           <w:rFonts w:ascii="Calibri Light" w:eastAsia="Calibri" w:hAnsi="Calibri Light" w:cs="Calibri Light"/>
           <w:b/>
         </w:rPr>
-        <w:t>____________</w:t>
-      </w:r>
-      <w:r>
-        <w:rPr>
-          <w:rFonts w:ascii="Calibri Light" w:eastAsia="Calibri" w:hAnsi="Calibri Light" w:cs="Calibri Light"/>
-        </w:rPr>
-        <w:t xml:space="preserve">, selaku </w:t>
+        <w:t/>
+      </w:r>
+      <w:r>
+        <w:rPr>
+          <w:rFonts w:ascii="Calibri Light" w:eastAsia="Calibri" w:hAnsi="Calibri Light" w:cs="Calibri Light"/>
+        </w:rPr>
+        <w:t xml:space="preserve"/>
       </w:r>
       <w:r>
         <w:rPr>
           <w:rFonts w:ascii="Calibri Light" w:eastAsia="Calibri" w:hAnsi="Calibri Light" w:cs="Calibri Light"/>
           <w:b/>
         </w:rPr>
-        <w:t>____________</w:t>
+        <w:t/>
       </w:r>
       <w:r>
         <w:rPr>
@@ -462,62 +465,88 @@
           <w:rFonts w:ascii="Calibri Light" w:eastAsia="Calibri" w:hAnsi="Calibri Light" w:cs="Calibri Light"/>
           <w:b/>
         </w:rPr>
-        <w:t>____________</w:t>
-      </w:r>
-      <w:r>
-        <w:rPr>
-          <w:rFonts w:ascii="Calibri Light" w:eastAsia="Calibri" w:hAnsi="Calibri Light" w:cs="Calibri Light"/>
-        </w:rPr>
-        <w:t>, _________, selanjutnya disebut “</w:t>
+        <w:t>{{PIHAK_KEDUA_NAMA}}, beralamat di {{PIHAK_KEDUA_ALAMAT}}, dalam hal ini diwakili oleh {{PIHAK_KEDUA_PEJABAT}} selaku {{PIHAK_KEDUA_JABATAN}}, selanjutnya disebut “PIHAK KEDUA”.</w:t>
+      </w:r>
+      <w:r>
+        <w:rPr>
+          <w:rFonts w:ascii="Calibri Light" w:eastAsia="Calibri" w:hAnsi="Calibri Light" w:cs="Calibri Light"/>
+        </w:rPr>
+        <w:t/>
       </w:r>
       <w:r>
         <w:rPr>
           <w:rFonts w:ascii="Calibri Light" w:eastAsia="Calibri" w:hAnsi="Calibri Light" w:cs="Calibri Light"/>
           <w:b/>
         </w:rPr>
+        <w:t/>
+      </w:r>
+      <w:r>
+        <w:rPr>
+          <w:rFonts w:ascii="Calibri Light" w:eastAsia="Calibri" w:hAnsi="Calibri Light" w:cs="Calibri Light"/>
+        </w:rPr>
+        <w:t/>
+      </w:r>
+    </w:p>
+    <w:p>
+      <w:pPr>
+        <w:spacing w:line="276" w:lineRule="auto"/>
+        <w:ind w:right="4"/>
+        <w:jc w:val="both"/>
+        <w:rPr>
+          <w:rFonts w:ascii="Calibri Light" w:eastAsia="Calibri" w:hAnsi="Calibri Light" w:cs="Calibri Light"/>
+        </w:rPr>
+      </w:pPr>
+      <w:r>
+        <w:rPr>
+          <w:rFonts w:ascii="Calibri Light" w:eastAsia="Calibri" w:hAnsi="Calibri Light" w:cs="Calibri Light"/>
+          <w:b/>
+        </w:rPr>
+        <w:t>PIHAK PERTAMA</w:t>
+      </w:r>
+      <w:r>
+        <w:rPr>
+          <w:rFonts w:ascii="Calibri Light" w:eastAsia="Calibri" w:hAnsi="Calibri Light" w:cs="Calibri Light"/>
+        </w:rPr>
+        <w:t xml:space="preserve"> dan </w:t>
+      </w:r>
+      <w:r>
+        <w:rPr>
+          <w:rFonts w:ascii="Calibri Light" w:eastAsia="Calibri" w:hAnsi="Calibri Light" w:cs="Calibri Light"/>
+          <w:b/>
+        </w:rPr>
         <w:t>PIHAK KEDUA</w:t>
       </w:r>
       <w:r>
         <w:rPr>
           <w:rFonts w:ascii="Calibri Light" w:eastAsia="Calibri" w:hAnsi="Calibri Light" w:cs="Calibri Light"/>
         </w:rPr>
-        <w:t>”.</w:t>
-      </w:r>
-    </w:p>
-    <w:p>
-      <w:pPr>
-        <w:spacing w:line="276" w:lineRule="auto"/>
-        <w:ind w:right="4"/>
-        <w:jc w:val="both"/>
-        <w:rPr>
-          <w:rFonts w:ascii="Calibri Light" w:eastAsia="Calibri" w:hAnsi="Calibri Light" w:cs="Calibri Light"/>
-        </w:rPr>
-      </w:pPr>
+        <w:t xml:space="preserve"> secara bersama-sama disebut sebagai “</w:t>
+      </w:r>
       <w:r>
         <w:rPr>
           <w:rFonts w:ascii="Calibri Light" w:eastAsia="Calibri" w:hAnsi="Calibri Light" w:cs="Calibri Light"/>
           <w:b/>
         </w:rPr>
-        <w:t>PIHAK PERTAMA</w:t>
-      </w:r>
-      <w:r>
-        <w:rPr>
-          <w:rFonts w:ascii="Calibri Light" w:eastAsia="Calibri" w:hAnsi="Calibri Light" w:cs="Calibri Light"/>
-        </w:rPr>
-        <w:t xml:space="preserve"> dan </w:t>
+        <w:t>PARA PIHAK</w:t>
+      </w:r>
+      <w:r>
+        <w:rPr>
+          <w:rFonts w:ascii="Calibri Light" w:eastAsia="Calibri" w:hAnsi="Calibri Light" w:cs="Calibri Light"/>
+        </w:rPr>
+        <w:t>” sedangkan masing-masing diantaranya akan disebut sebagai “</w:t>
       </w:r>
       <w:r>
         <w:rPr>
           <w:rFonts w:ascii="Calibri Light" w:eastAsia="Calibri" w:hAnsi="Calibri Light" w:cs="Calibri Light"/>
           <w:b/>
         </w:rPr>
-        <w:t>PIHAK KEDUA</w:t>
-      </w:r>
-      <w:r>
-        <w:rPr>
-          <w:rFonts w:ascii="Calibri Light" w:eastAsia="Calibri" w:hAnsi="Calibri Light" w:cs="Calibri Light"/>
-        </w:rPr>
-        <w:t xml:space="preserve"> secara bersama-sama disebut sebagai “</w:t>
+        <w:t>PIHAK</w:t>
+      </w:r>
+      <w:r>
+        <w:rPr>
+          <w:rFonts w:ascii="Calibri Light" w:eastAsia="Calibri" w:hAnsi="Calibri Light" w:cs="Calibri Light"/>
+        </w:rPr>
+        <w:t xml:space="preserve">”. </w:t>
       </w:r>
       <w:r>
         <w:rPr>
@@ -530,32 +559,6 @@
         <w:rPr>
           <w:rFonts w:ascii="Calibri Light" w:eastAsia="Calibri" w:hAnsi="Calibri Light" w:cs="Calibri Light"/>
         </w:rPr>
-        <w:t>” sedangkan masing-masing diantaranya akan disebut sebagai “</w:t>
-      </w:r>
-      <w:r>
-        <w:rPr>
-          <w:rFonts w:ascii="Calibri Light" w:eastAsia="Calibri" w:hAnsi="Calibri Light" w:cs="Calibri Light"/>
-          <w:b/>
-        </w:rPr>
-        <w:t>PIHAK</w:t>
-      </w:r>
-      <w:r>
-        <w:rPr>
-          <w:rFonts w:ascii="Calibri Light" w:eastAsia="Calibri" w:hAnsi="Calibri Light" w:cs="Calibri Light"/>
-        </w:rPr>
-        <w:t xml:space="preserve">”. </w:t>
-      </w:r>
-      <w:r>
-        <w:rPr>
-          <w:rFonts w:ascii="Calibri Light" w:eastAsia="Calibri" w:hAnsi="Calibri Light" w:cs="Calibri Light"/>
-          <w:b/>
-        </w:rPr>
-        <w:t>PARA PIHAK</w:t>
-      </w:r>
-      <w:r>
-        <w:rPr>
-          <w:rFonts w:ascii="Calibri Light" w:eastAsia="Calibri" w:hAnsi="Calibri Light" w:cs="Calibri Light"/>
-        </w:rPr>
         <w:t xml:space="preserve"> terlebih dahulu menerangkan bahwa:</w:t>
       </w:r>
     </w:p>
@@ -614,7 +617,7 @@
           <w:rFonts w:ascii="Calibri Light" w:eastAsia="Calibri" w:hAnsi="Calibri Light" w:cs="Calibri Light"/>
           <w:color w:val="000000"/>
         </w:rPr>
-        <w:t xml:space="preserve">PIHAK KEDUA adalah perusahaan yang bergerak di bidang ____________; </w:t>
+        <w:t xml:space="preserve">PIHAK KEDUA adalah perusahaan yang bergerak di bidang {{PIHAK_KEDUA_BIDANG}}; </w:t>
       </w:r>
     </w:p>
     <w:p>
@@ -648,14 +651,14 @@
           <w:rFonts w:ascii="Calibri Light" w:eastAsia="Calibri" w:hAnsi="Calibri Light" w:cs="Calibri Light"/>
           <w:color w:val="000000"/>
         </w:rPr>
-        <w:t xml:space="preserve"> mengenai pengadaan </w:t>
+        <w:t xml:space="preserve"> mengenai pengadaan {{JENIS_PEKERJAAN}}</w:t>
       </w:r>
       <w:r>
         <w:rPr>
           <w:rFonts w:ascii="Calibri Light" w:hAnsi="Calibri Light" w:cs="Calibri Light"/>
           <w:color w:val="000000"/>
         </w:rPr>
-        <w:t>_____________ (</w:t>
+        <w:t> (</w:t>
       </w:r>
       <w:r>
         <w:rPr>
@@ -709,7 +712,7 @@
           <w:rFonts w:ascii="Calibri Light" w:eastAsia="Calibri" w:hAnsi="Calibri Light" w:cs="Calibri Light"/>
           <w:color w:val="000000"/>
         </w:rPr>
-        <w:t>untuk merealisasikan Pekerjaan tersebut, PIHAK KEDUA telah mengajukan penawaran kepada PIHAK PERTAMA melalui Surat Penawaran No. ____________ perihal ____________</w:t>
+        <w:t>untuk merealisasikan Pekerjaan tersebut, PIHAK KEDUA telah mengajukan penawaran kepada PIHAK PERTAMA melalui Surat Penawaran No. {{SURAT_PENAWARAN_NOMOR}} perihal {{SURAT_PENAWARAN_PERIHAL}} pada tanggal {{SURAT_PENAWARAN_TANGGAL}}</w:t>
       </w:r>
       <w:r>
         <w:rPr>
@@ -717,158 +720,158 @@
           <w:b/>
           <w:color w:val="000000"/>
         </w:rPr>
+        <w:t xml:space="preserve"/>
+      </w:r>
+      <w:r>
+        <w:rPr>
+          <w:rFonts w:ascii="Calibri Light" w:eastAsia="Calibri" w:hAnsi="Calibri Light" w:cs="Calibri Light"/>
+          <w:color w:val="000000"/>
+        </w:rPr>
+        <w:t xml:space="preserve"/>
+      </w:r>
+      <w:r>
+        <w:rPr>
+          <w:rFonts w:ascii="Calibri Light" w:eastAsia="Calibri" w:hAnsi="Calibri Light" w:cs="Calibri Light"/>
+          <w:b/>
+          <w:color w:val="000000"/>
+        </w:rPr>
+        <w:t/>
+      </w:r>
+      <w:r>
+        <w:rPr>
+          <w:rFonts w:ascii="Calibri Light" w:eastAsia="Calibri" w:hAnsi="Calibri Light" w:cs="Calibri Light"/>
+          <w:color w:val="000000"/>
+        </w:rPr>
+        <w:t xml:space="preserve"> (‘’</w:t>
+      </w:r>
+      <w:r>
+        <w:rPr>
+          <w:rFonts w:ascii="Calibri Light" w:eastAsia="Calibri" w:hAnsi="Calibri Light" w:cs="Calibri Light"/>
+          <w:b/>
+          <w:color w:val="000000"/>
+        </w:rPr>
+        <w:t>Proposal</w:t>
+      </w:r>
+      <w:r>
+        <w:rPr>
+          <w:rFonts w:ascii="Calibri Light" w:eastAsia="Calibri" w:hAnsi="Calibri Light" w:cs="Calibri Light"/>
+          <w:color w:val="000000"/>
+        </w:rPr>
+        <w:t>”); dan</w:t>
+      </w:r>
+    </w:p>
+    <w:p>
+      <w:pPr>
+        <w:numPr>
+          <w:ilvl w:val="0"/>
+          <w:numId w:val="19"/>
+        </w:numPr>
+        <w:pBdr>
+          <w:top w:val="nil"/>
+          <w:left w:val="nil"/>
+          <w:bottom w:val="nil"/>
+          <w:right w:val="nil"/>
+          <w:between w:val="nil"/>
+        </w:pBdr>
+        <w:spacing w:line="276" w:lineRule="auto"/>
+        <w:ind w:right="4"/>
+        <w:jc w:val="both"/>
+        <w:rPr>
+          <w:rFonts w:ascii="Calibri Light" w:eastAsia="Calibri" w:hAnsi="Calibri Light" w:cs="Calibri Light"/>
+          <w:color w:val="000000"/>
+        </w:rPr>
+      </w:pPr>
+      <w:r>
+        <w:rPr>
+          <w:rFonts w:ascii="Calibri Light" w:eastAsia="Calibri" w:hAnsi="Calibri Light" w:cs="Calibri Light"/>
+          <w:color w:val="000000"/>
+        </w:rPr>
+        <w:t xml:space="preserve">PIHAK PERTAMA telah menunjuk PIHAK KEDUA sebagai pelaksana Pekerjaan berdasarkan Surat Penunjukan No. {{SURAT_PENUNJUKAN_NOMOR}} perihal {{SURAT_PENUNJUKAN_PERIHAL}} pada tanggal {{SURAT_PENUNJUKAN_TANGGAL}}</w:t>
+      </w:r>
+      <w:r>
+        <w:rPr>
+          <w:rFonts w:ascii="Calibri Light" w:eastAsia="Calibri" w:hAnsi="Calibri Light" w:cs="Calibri Light"/>
+          <w:b/>
+          <w:color w:val="000000"/>
+        </w:rPr>
+        <w:t/>
+      </w:r>
+      <w:r>
+        <w:rPr>
+          <w:rFonts w:ascii="Calibri Light" w:eastAsia="Calibri" w:hAnsi="Calibri Light" w:cs="Calibri Light"/>
+          <w:color w:val="000000"/>
+        </w:rPr>
+        <w:t xml:space="preserve"/>
+      </w:r>
+      <w:r>
+        <w:rPr>
+          <w:rFonts w:ascii="Calibri Light" w:eastAsia="Calibri" w:hAnsi="Calibri Light" w:cs="Calibri Light"/>
+          <w:b/>
+          <w:color w:val="000000"/>
+        </w:rPr>
+        <w:t/>
+      </w:r>
+      <w:r>
+        <w:rPr>
+          <w:rFonts w:ascii="Calibri Light" w:eastAsia="Calibri" w:hAnsi="Calibri Light" w:cs="Calibri Light"/>
+          <w:color w:val="000000"/>
+        </w:rPr>
+        <w:t xml:space="preserve"/>
+      </w:r>
+      <w:r>
+        <w:rPr>
+          <w:rFonts w:ascii="Calibri Light" w:eastAsia="Calibri" w:hAnsi="Calibri Light" w:cs="Calibri Light"/>
+          <w:b/>
+          <w:color w:val="000000"/>
+        </w:rPr>
+        <w:t/>
+      </w:r>
+      <w:r>
+        <w:rPr>
+          <w:rFonts w:ascii="Calibri Light" w:eastAsia="Calibri" w:hAnsi="Calibri Light" w:cs="Calibri Light"/>
+          <w:color w:val="000000"/>
+        </w:rPr>
+        <w:t>.</w:t>
+      </w:r>
+    </w:p>
+    <w:p>
+      <w:pPr>
+        <w:pBdr>
+          <w:top w:val="nil"/>
+          <w:left w:val="nil"/>
+          <w:bottom w:val="nil"/>
+          <w:right w:val="nil"/>
+          <w:between w:val="nil"/>
+        </w:pBdr>
+        <w:spacing w:line="276" w:lineRule="auto"/>
+        <w:ind w:left="720" w:right="4"/>
+        <w:jc w:val="both"/>
+        <w:rPr>
+          <w:rFonts w:ascii="Calibri Light" w:eastAsia="Calibri" w:hAnsi="Calibri Light" w:cs="Calibri Light"/>
+          <w:color w:val="000000"/>
+        </w:rPr>
+      </w:pPr>
+    </w:p>
+    <w:p>
+      <w:pPr>
+        <w:jc w:val="both"/>
+        <w:rPr>
+          <w:rFonts w:ascii="Calibri Light" w:eastAsia="Calibri" w:hAnsi="Calibri Light" w:cs="Calibri Light"/>
+        </w:rPr>
+      </w:pPr>
+      <w:r>
+        <w:rPr>
+          <w:rFonts w:ascii="Calibri Light" w:eastAsia="Calibri" w:hAnsi="Calibri Light" w:cs="Calibri Light"/>
+        </w:rPr>
+        <w:lastRenderedPageBreak/>
+        <w:t xml:space="preserve">Berdasarkan hal-hal tersebut di atas, PARA PIHAK setuju untuk saling mengikatkan diri satu sama lain dalam Perjanjian Kerja Sama antara PT Reasuransi Indonesia Utama (Persero) dengan {{PIHAK_KEDUA_NAMA}} tentang {{JENIS_PEKERJAAN}}</w:t>
+      </w:r>
+      <w:r>
+        <w:rPr>
+          <w:rFonts w:ascii="Calibri Light" w:eastAsia="Calibri" w:hAnsi="Calibri Light" w:cs="Calibri Light"/>
+          <w:b/>
+        </w:rPr>
         <w:t xml:space="preserve"> </w:t>
-      </w:r>
-      <w:r>
-        <w:rPr>
-          <w:rFonts w:ascii="Calibri Light" w:eastAsia="Calibri" w:hAnsi="Calibri Light" w:cs="Calibri Light"/>
-          <w:color w:val="000000"/>
-        </w:rPr>
-        <w:t xml:space="preserve">pada tanggal </w:t>
-      </w:r>
-      <w:r>
-        <w:rPr>
-          <w:rFonts w:ascii="Calibri Light" w:eastAsia="Calibri" w:hAnsi="Calibri Light" w:cs="Calibri Light"/>
-          <w:b/>
-          <w:color w:val="000000"/>
-        </w:rPr>
-        <w:t>____________</w:t>
-      </w:r>
-      <w:r>
-        <w:rPr>
-          <w:rFonts w:ascii="Calibri Light" w:eastAsia="Calibri" w:hAnsi="Calibri Light" w:cs="Calibri Light"/>
-          <w:color w:val="000000"/>
-        </w:rPr>
-        <w:t xml:space="preserve"> (‘’</w:t>
-      </w:r>
-      <w:r>
-        <w:rPr>
-          <w:rFonts w:ascii="Calibri Light" w:eastAsia="Calibri" w:hAnsi="Calibri Light" w:cs="Calibri Light"/>
-          <w:b/>
-          <w:color w:val="000000"/>
-        </w:rPr>
-        <w:t>Proposal</w:t>
-      </w:r>
-      <w:r>
-        <w:rPr>
-          <w:rFonts w:ascii="Calibri Light" w:eastAsia="Calibri" w:hAnsi="Calibri Light" w:cs="Calibri Light"/>
-          <w:color w:val="000000"/>
-        </w:rPr>
-        <w:t>”); dan</w:t>
-      </w:r>
-    </w:p>
-    <w:p>
-      <w:pPr>
-        <w:numPr>
-          <w:ilvl w:val="0"/>
-          <w:numId w:val="19"/>
-        </w:numPr>
-        <w:pBdr>
-          <w:top w:val="nil"/>
-          <w:left w:val="nil"/>
-          <w:bottom w:val="nil"/>
-          <w:right w:val="nil"/>
-          <w:between w:val="nil"/>
-        </w:pBdr>
-        <w:spacing w:line="276" w:lineRule="auto"/>
-        <w:ind w:right="4"/>
-        <w:jc w:val="both"/>
-        <w:rPr>
-          <w:rFonts w:ascii="Calibri Light" w:eastAsia="Calibri" w:hAnsi="Calibri Light" w:cs="Calibri Light"/>
-          <w:color w:val="000000"/>
-        </w:rPr>
-      </w:pPr>
-      <w:r>
-        <w:rPr>
-          <w:rFonts w:ascii="Calibri Light" w:eastAsia="Calibri" w:hAnsi="Calibri Light" w:cs="Calibri Light"/>
-          <w:color w:val="000000"/>
-        </w:rPr>
-        <w:t xml:space="preserve">PIHAK PERTAMA telah menunjuk PIHAK KEDUA sebagai pelaksana Pekerjaan berdasarkan Surat Penunjukan No. </w:t>
-      </w:r>
-      <w:r>
-        <w:rPr>
-          <w:rFonts w:ascii="Calibri Light" w:eastAsia="Calibri" w:hAnsi="Calibri Light" w:cs="Calibri Light"/>
-          <w:b/>
-          <w:color w:val="000000"/>
-        </w:rPr>
-        <w:t>____________</w:t>
-      </w:r>
-      <w:r>
-        <w:rPr>
-          <w:rFonts w:ascii="Calibri Light" w:eastAsia="Calibri" w:hAnsi="Calibri Light" w:cs="Calibri Light"/>
-          <w:color w:val="000000"/>
-        </w:rPr>
-        <w:t xml:space="preserve"> perihal </w:t>
-      </w:r>
-      <w:r>
-        <w:rPr>
-          <w:rFonts w:ascii="Calibri Light" w:eastAsia="Calibri" w:hAnsi="Calibri Light" w:cs="Calibri Light"/>
-          <w:b/>
-          <w:color w:val="000000"/>
-        </w:rPr>
-        <w:t>____________</w:t>
-      </w:r>
-      <w:r>
-        <w:rPr>
-          <w:rFonts w:ascii="Calibri Light" w:eastAsia="Calibri" w:hAnsi="Calibri Light" w:cs="Calibri Light"/>
-          <w:color w:val="000000"/>
-        </w:rPr>
-        <w:t xml:space="preserve"> pada tanggal </w:t>
-      </w:r>
-      <w:r>
-        <w:rPr>
-          <w:rFonts w:ascii="Calibri Light" w:eastAsia="Calibri" w:hAnsi="Calibri Light" w:cs="Calibri Light"/>
-          <w:b/>
-          <w:color w:val="000000"/>
-        </w:rPr>
-        <w:t>____________</w:t>
-      </w:r>
-      <w:r>
-        <w:rPr>
-          <w:rFonts w:ascii="Calibri Light" w:eastAsia="Calibri" w:hAnsi="Calibri Light" w:cs="Calibri Light"/>
-          <w:color w:val="000000"/>
-        </w:rPr>
-        <w:t>.</w:t>
-      </w:r>
-    </w:p>
-    <w:p>
-      <w:pPr>
-        <w:pBdr>
-          <w:top w:val="nil"/>
-          <w:left w:val="nil"/>
-          <w:bottom w:val="nil"/>
-          <w:right w:val="nil"/>
-          <w:between w:val="nil"/>
-        </w:pBdr>
-        <w:spacing w:line="276" w:lineRule="auto"/>
-        <w:ind w:left="720" w:right="4"/>
-        <w:jc w:val="both"/>
-        <w:rPr>
-          <w:rFonts w:ascii="Calibri Light" w:eastAsia="Calibri" w:hAnsi="Calibri Light" w:cs="Calibri Light"/>
-          <w:color w:val="000000"/>
-        </w:rPr>
-      </w:pPr>
-    </w:p>
-    <w:p>
-      <w:pPr>
-        <w:jc w:val="both"/>
-        <w:rPr>
-          <w:rFonts w:ascii="Calibri Light" w:eastAsia="Calibri" w:hAnsi="Calibri Light" w:cs="Calibri Light"/>
-        </w:rPr>
-      </w:pPr>
-      <w:r>
-        <w:rPr>
-          <w:rFonts w:ascii="Calibri Light" w:eastAsia="Calibri" w:hAnsi="Calibri Light" w:cs="Calibri Light"/>
-        </w:rPr>
-        <w:lastRenderedPageBreak/>
-        <w:t xml:space="preserve">Berdasarkan hal-hal tersebut di atas, PARA PIHAK setuju untuk saling mengikatkan diri satu sama lain dalam Perjanjian Kerja Sama antara PT Reasuransi Indonesia Utama (Persero) dengan _____ tentang </w:t>
-      </w:r>
-      <w:r>
-        <w:rPr>
-          <w:rFonts w:ascii="Calibri Light" w:eastAsia="Calibri" w:hAnsi="Calibri Light" w:cs="Calibri Light"/>
-          <w:b/>
-        </w:rPr>
-        <w:t xml:space="preserve">____________ </w:t>
       </w:r>
       <w:r>
         <w:rPr>
@@ -1128,7 +1131,7 @@
                 <w:rFonts w:ascii="Calibri Light" w:eastAsia="Calibri" w:hAnsi="Calibri Light" w:cs="Calibri Light"/>
                 <w:b/>
               </w:rPr>
-              <w:t xml:space="preserve">____________ </w:t>
+              <w:t xml:space="preserve">{{PIHAK_KEDUA_NAMA}}</w:t>
             </w:r>
           </w:p>
           <w:p>
@@ -1234,14 +1237,14 @@
               <w:rPr>
                 <w:rFonts w:ascii="Calibri Light" w:eastAsia="Calibri" w:hAnsi="Calibri Light" w:cs="Calibri Light"/>
               </w:rPr>
-              <w:t>Nama</w:t>
+              <w:t>Nama: {{PIHAK_KEDUA_PEJABAT}}</w:t>
             </w:r>
             <w:r>
               <w:rPr>
                 <w:rFonts w:ascii="Calibri Light" w:eastAsia="Calibri" w:hAnsi="Calibri Light" w:cs="Calibri Light"/>
               </w:rPr>
               <w:tab/>
-              <w:t>: ____________</w:t>
+              <w:t/>
             </w:r>
           </w:p>
           <w:p>
@@ -1260,7 +1263,7 @@
               <w:rPr>
                 <w:rFonts w:ascii="Calibri Light" w:eastAsia="Calibri" w:hAnsi="Calibri Light" w:cs="Calibri Light"/>
               </w:rPr>
-              <w:t>Jabatan: ____________</w:t>
+              <w:t>Jabatan: {{PIHAK_KEDUA_JABATAN}}</w:t>
             </w:r>
           </w:p>
         </w:tc>
@@ -1384,21 +1387,21 @@
               <w:rPr>
                 <w:rFonts w:ascii="Calibri Light" w:eastAsia="Calibri" w:hAnsi="Calibri Light" w:cs="Calibri Light"/>
               </w:rPr>
-              <w:t>Nama</w:t>
+              <w:t>Nama: {{PIHAK_PERTAMA_PEJABAT}}</w:t>
             </w:r>
             <w:r>
               <w:rPr>
                 <w:rFonts w:ascii="Calibri Light" w:eastAsia="Calibri" w:hAnsi="Calibri Light" w:cs="Calibri Light"/>
               </w:rPr>
               <w:tab/>
-              <w:t xml:space="preserve">: </w:t>
+              <w:t xml:space="preserve"/>
             </w:r>
             <w:r>
               <w:rPr>
                 <w:rFonts w:ascii="Calibri Light" w:eastAsia="Calibri" w:hAnsi="Calibri Light" w:cs="Calibri Light"/>
                 <w:b/>
               </w:rPr>
-              <w:t xml:space="preserve">____________ </w:t>
+              <w:t xml:space="preserve"> </w:t>
             </w:r>
           </w:p>
           <w:p>
@@ -1416,14 +1419,14 @@
               <w:rPr>
                 <w:rFonts w:ascii="Calibri Light" w:eastAsia="Calibri" w:hAnsi="Calibri Light" w:cs="Calibri Light"/>
               </w:rPr>
-              <w:t xml:space="preserve">Jabatan: </w:t>
+              <w:t xml:space="preserve">Jabatan: {{PIHAK_PERTAMA_JABATAN}}</w:t>
             </w:r>
             <w:r>
               <w:rPr>
                 <w:rFonts w:ascii="Calibri Light" w:eastAsia="Calibri" w:hAnsi="Calibri Light" w:cs="Calibri Light"/>
                 <w:b/>
               </w:rPr>
-              <w:t>____________</w:t>
+              <w:t/>
             </w:r>
           </w:p>
         </w:tc>
@@ -1431,156 +1434,7 @@
     </w:tbl>
     <w:p>
       <w:pPr>
-        <w:spacing w:line="276" w:lineRule="auto"/>
-        <w:jc w:val="both"/>
-        <w:rPr>
-          <w:rFonts w:ascii="Calibri Light" w:eastAsia="Calibri" w:hAnsi="Calibri Light" w:cs="Calibri Light"/>
-          <w:b/>
-        </w:rPr>
-      </w:pPr>
-    </w:p>
-    <w:p>
-      <w:pPr>
-        <w:spacing w:line="276" w:lineRule="auto"/>
-        <w:jc w:val="both"/>
-        <w:rPr>
-          <w:rFonts w:ascii="Calibri Light" w:eastAsia="Calibri" w:hAnsi="Calibri Light" w:cs="Calibri Light"/>
-          <w:b/>
-        </w:rPr>
-      </w:pPr>
-    </w:p>
-    <w:p>
-      <w:pPr>
-        <w:spacing w:line="276" w:lineRule="auto"/>
-        <w:jc w:val="both"/>
-        <w:rPr>
-          <w:rFonts w:ascii="Calibri Light" w:eastAsia="Calibri" w:hAnsi="Calibri Light" w:cs="Calibri Light"/>
-          <w:b/>
-        </w:rPr>
-      </w:pPr>
-    </w:p>
-    <w:p>
-      <w:pPr>
-        <w:spacing w:line="276" w:lineRule="auto"/>
-        <w:jc w:val="both"/>
-        <w:rPr>
-          <w:rFonts w:ascii="Calibri Light" w:eastAsia="Calibri" w:hAnsi="Calibri Light" w:cs="Calibri Light"/>
-          <w:b/>
-        </w:rPr>
-      </w:pPr>
-    </w:p>
-    <w:p>
-      <w:pPr>
-        <w:spacing w:line="276" w:lineRule="auto"/>
-        <w:jc w:val="both"/>
-        <w:rPr>
-          <w:rFonts w:ascii="Calibri Light" w:eastAsia="Calibri" w:hAnsi="Calibri Light" w:cs="Calibri Light"/>
-          <w:b/>
-        </w:rPr>
-      </w:pPr>
-    </w:p>
-    <w:p>
-      <w:pPr>
-        <w:spacing w:line="276" w:lineRule="auto"/>
-        <w:jc w:val="both"/>
-        <w:rPr>
-          <w:rFonts w:ascii="Calibri Light" w:eastAsia="Calibri" w:hAnsi="Calibri Light" w:cs="Calibri Light"/>
-          <w:b/>
-        </w:rPr>
-      </w:pPr>
-    </w:p>
-    <w:p>
-      <w:pPr>
-        <w:spacing w:line="276" w:lineRule="auto"/>
-        <w:jc w:val="both"/>
-        <w:rPr>
-          <w:rFonts w:ascii="Calibri Light" w:eastAsia="Calibri" w:hAnsi="Calibri Light" w:cs="Calibri Light"/>
-          <w:b/>
-        </w:rPr>
-      </w:pPr>
-    </w:p>
-    <w:p>
-      <w:pPr>
-        <w:spacing w:line="276" w:lineRule="auto"/>
-        <w:jc w:val="both"/>
-        <w:rPr>
-          <w:rFonts w:ascii="Calibri Light" w:eastAsia="Calibri" w:hAnsi="Calibri Light" w:cs="Calibri Light"/>
-          <w:b/>
-        </w:rPr>
-      </w:pPr>
-    </w:p>
-    <w:p>
-      <w:pPr>
-        <w:spacing w:line="276" w:lineRule="auto"/>
-        <w:jc w:val="both"/>
-        <w:rPr>
-          <w:rFonts w:ascii="Calibri Light" w:eastAsia="Calibri" w:hAnsi="Calibri Light" w:cs="Calibri Light"/>
-          <w:b/>
-        </w:rPr>
-      </w:pPr>
-    </w:p>
-    <w:p>
-      <w:pPr>
-        <w:spacing w:line="276" w:lineRule="auto"/>
-        <w:jc w:val="both"/>
-        <w:rPr>
-          <w:rFonts w:ascii="Calibri Light" w:eastAsia="Calibri" w:hAnsi="Calibri Light" w:cs="Calibri Light"/>
-          <w:b/>
-        </w:rPr>
-      </w:pPr>
-    </w:p>
-    <w:p>
-      <w:pPr>
-        <w:spacing w:line="276" w:lineRule="auto"/>
-        <w:jc w:val="both"/>
-        <w:rPr>
-          <w:rFonts w:ascii="Calibri Light" w:eastAsia="Calibri" w:hAnsi="Calibri Light" w:cs="Calibri Light"/>
-          <w:b/>
-        </w:rPr>
-      </w:pPr>
-    </w:p>
-    <w:p>
-      <w:pPr>
-        <w:spacing w:line="276" w:lineRule="auto"/>
-        <w:jc w:val="both"/>
-        <w:rPr>
-          <w:rFonts w:ascii="Calibri Light" w:eastAsia="Calibri" w:hAnsi="Calibri Light" w:cs="Calibri Light"/>
-          <w:b/>
-        </w:rPr>
-      </w:pPr>
-    </w:p>
-    <w:p>
-      <w:pPr>
-        <w:spacing w:line="276" w:lineRule="auto"/>
-        <w:jc w:val="both"/>
-        <w:rPr>
-          <w:rFonts w:ascii="Calibri Light" w:eastAsia="Calibri" w:hAnsi="Calibri Light" w:cs="Calibri Light"/>
-          <w:b/>
-        </w:rPr>
-      </w:pPr>
-    </w:p>
-    <w:p>
-      <w:pPr>
-        <w:spacing w:line="276" w:lineRule="auto"/>
-        <w:jc w:val="both"/>
-        <w:rPr>
-          <w:rFonts w:ascii="Calibri Light" w:eastAsia="Calibri" w:hAnsi="Calibri Light" w:cs="Calibri Light"/>
-          <w:b/>
-        </w:rPr>
-      </w:pPr>
-    </w:p>
-    <w:p>
-      <w:pPr>
-        <w:spacing w:line="276" w:lineRule="auto"/>
-        <w:jc w:val="center"/>
-        <w:rPr>
-          <w:rFonts w:ascii="Calibri Light" w:eastAsia="Calibri" w:hAnsi="Calibri Light" w:cs="Calibri Light"/>
-          <w:b/>
-        </w:rPr>
-      </w:pPr>
-    </w:p>
-    <w:p>
-      <w:pPr>
+        <w:pageBreakBefore/>
         <w:spacing w:line="276" w:lineRule="auto"/>
         <w:jc w:val="center"/>
         <w:rPr>
@@ -10354,137 +10208,7 @@
     </w:p>
     <w:p>
       <w:pPr>
-        <w:tabs>
-          <w:tab w:val="left" w:pos="0"/>
-        </w:tabs>
-        <w:spacing w:line="276" w:lineRule="auto"/>
-        <w:jc w:val="both"/>
-        <w:rPr>
-          <w:rFonts w:ascii="Calibri Light" w:eastAsia="Calibri" w:hAnsi="Calibri Light" w:cs="Calibri Light"/>
-        </w:rPr>
-      </w:pPr>
-    </w:p>
-    <w:p>
-      <w:pPr>
-        <w:tabs>
-          <w:tab w:val="left" w:pos="0"/>
-        </w:tabs>
-        <w:spacing w:line="276" w:lineRule="auto"/>
-        <w:jc w:val="both"/>
-        <w:rPr>
-          <w:rFonts w:ascii="Calibri Light" w:eastAsia="Calibri" w:hAnsi="Calibri Light" w:cs="Calibri Light"/>
-        </w:rPr>
-      </w:pPr>
-    </w:p>
-    <w:p>
-      <w:pPr>
-        <w:spacing w:line="276" w:lineRule="auto"/>
-        <w:jc w:val="center"/>
-        <w:rPr>
-          <w:rFonts w:ascii="Calibri Light" w:eastAsia="Calibri" w:hAnsi="Calibri Light" w:cs="Calibri Light"/>
-        </w:rPr>
-      </w:pPr>
-    </w:p>
-    <w:p>
-      <w:pPr>
-        <w:spacing w:line="276" w:lineRule="auto"/>
-        <w:jc w:val="center"/>
-        <w:rPr>
-          <w:rFonts w:ascii="Calibri Light" w:eastAsia="Calibri" w:hAnsi="Calibri Light" w:cs="Calibri Light"/>
-        </w:rPr>
-      </w:pPr>
-    </w:p>
-    <w:p>
-      <w:pPr>
-        <w:spacing w:line="276" w:lineRule="auto"/>
-        <w:jc w:val="center"/>
-        <w:rPr>
-          <w:rFonts w:ascii="Calibri Light" w:eastAsia="Calibri" w:hAnsi="Calibri Light" w:cs="Calibri Light"/>
-        </w:rPr>
-      </w:pPr>
-    </w:p>
-    <w:p>
-      <w:pPr>
-        <w:spacing w:line="276" w:lineRule="auto"/>
-        <w:jc w:val="center"/>
-        <w:rPr>
-          <w:rFonts w:ascii="Calibri Light" w:eastAsia="Calibri" w:hAnsi="Calibri Light" w:cs="Calibri Light"/>
-        </w:rPr>
-      </w:pPr>
-    </w:p>
-    <w:p>
-      <w:pPr>
-        <w:spacing w:line="276" w:lineRule="auto"/>
-        <w:jc w:val="center"/>
-        <w:rPr>
-          <w:rFonts w:ascii="Calibri Light" w:eastAsia="Calibri" w:hAnsi="Calibri Light" w:cs="Calibri Light"/>
-        </w:rPr>
-      </w:pPr>
-    </w:p>
-    <w:p>
-      <w:pPr>
-        <w:spacing w:line="276" w:lineRule="auto"/>
-        <w:jc w:val="center"/>
-        <w:rPr>
-          <w:rFonts w:ascii="Calibri Light" w:eastAsia="Calibri" w:hAnsi="Calibri Light" w:cs="Calibri Light"/>
-        </w:rPr>
-      </w:pPr>
-    </w:p>
-    <w:p>
-      <w:pPr>
-        <w:spacing w:line="276" w:lineRule="auto"/>
-        <w:jc w:val="center"/>
-        <w:rPr>
-          <w:rFonts w:ascii="Calibri Light" w:eastAsia="Calibri" w:hAnsi="Calibri Light" w:cs="Calibri Light"/>
-        </w:rPr>
-      </w:pPr>
-    </w:p>
-    <w:p>
-      <w:pPr>
-        <w:spacing w:line="276" w:lineRule="auto"/>
-        <w:jc w:val="center"/>
-        <w:rPr>
-          <w:rFonts w:ascii="Calibri Light" w:eastAsia="Calibri" w:hAnsi="Calibri Light" w:cs="Calibri Light"/>
-        </w:rPr>
-      </w:pPr>
-    </w:p>
-    <w:p>
-      <w:pPr>
-        <w:spacing w:line="276" w:lineRule="auto"/>
-        <w:jc w:val="center"/>
-        <w:rPr>
-          <w:rFonts w:ascii="Calibri Light" w:eastAsia="Calibri" w:hAnsi="Calibri Light" w:cs="Calibri Light"/>
-        </w:rPr>
-      </w:pPr>
-    </w:p>
-    <w:p>
-      <w:pPr>
-        <w:spacing w:line="276" w:lineRule="auto"/>
-        <w:jc w:val="center"/>
-        <w:rPr>
-          <w:rFonts w:ascii="Calibri Light" w:eastAsia="Calibri" w:hAnsi="Calibri Light" w:cs="Calibri Light"/>
-        </w:rPr>
-      </w:pPr>
-    </w:p>
-    <w:p>
-      <w:pPr>
-        <w:spacing w:line="276" w:lineRule="auto"/>
-        <w:jc w:val="center"/>
-        <w:rPr>
-          <w:rFonts w:ascii="Calibri Light" w:eastAsia="Calibri" w:hAnsi="Calibri Light" w:cs="Calibri Light"/>
-        </w:rPr>
-      </w:pPr>
-    </w:p>
-    <w:p>
-      <w:pPr>
-        <w:spacing w:line="276" w:lineRule="auto"/>
-        <w:rPr>
-          <w:rFonts w:ascii="Calibri Light" w:eastAsia="Calibri" w:hAnsi="Calibri Light" w:cs="Calibri Light"/>
-        </w:rPr>
-      </w:pPr>
-    </w:p>
-    <w:p>
-      <w:pPr>
+        <w:pageBreakBefore/>
         <w:spacing w:line="276" w:lineRule="auto"/>
         <w:jc w:val="center"/>
         <w:rPr>
@@ -10577,7 +10301,7 @@
           <w:rFonts w:ascii="Calibri Light" w:eastAsia="Calibri" w:hAnsi="Calibri Light" w:cs="Calibri Light"/>
           <w:color w:val="000000"/>
         </w:rPr>
-        <w:t>Pekerjaan yang akan diserahkan kepada PIHAK KEDUA, yaitu ______.</w:t>
+        <w:t>Pekerjaan yang akan diserahkan kepada PIHAK KEDUA, yaitu {{JENIS_PEKERJAAN}}.</w:t>
       </w:r>
     </w:p>
     <w:p>
@@ -10660,6 +10384,9 @@
           <w:color w:val="000000"/>
         </w:rPr>
       </w:pPr>
+      <w:r>
+        <w:t>{{RUANG_LINGKUP_LIST}}</w:t>
+      </w:r>
     </w:p>
     <w:p>
       <w:pPr>
@@ -10729,7 +10456,7 @@
           <w:rFonts w:ascii="Calibri Light" w:eastAsia="Calibri" w:hAnsi="Calibri Light" w:cs="Calibri Light"/>
           <w:color w:val="000000"/>
         </w:rPr>
-        <w:t>Jangka waktu pelaksanaan Perjanjian ini yaitu berlaku sejak tanggal _____ sampai dengan tanggal _______.</w:t>
+        <w:t>Jangka waktu pelaksanaan Perjanjian ini yaitu berlaku sejak tanggal {{JANGKA_WAKTU_MULAI}} sampai dengan tanggal {{JANGKA_WAKTU_SELESAI}}.</w:t>
       </w:r>
     </w:p>
     <w:p>
@@ -10795,7 +10522,7 @@
           <w:rFonts w:ascii="Calibri Light" w:eastAsia="Calibri" w:hAnsi="Calibri Light" w:cs="Calibri Light"/>
           <w:color w:val="000000"/>
         </w:rPr>
-        <w:t xml:space="preserve">Tunduk pada ketentuan lain dalam Perjanjian ini, PARA PIHAK sepakat bahwa biaya pelaksanaan Ruang Lingkup Pekerjaan yang akan dibayarkan PIHAK PERTAMA kepada PIHAK KEDUA adalah sebesar </w:t>
+        <w:t xml:space="preserve">Tunduk pada ketentuan lain dalam Perjanjian ini, PARA PIHAK sepakat bahwa biaya pelaksanaan Ruang Lingkup Pekerjaan yang akan dibayarkan PIHAK PERTAMA kepada PIHAK KEDUA adalah sebesar {{NILAI_KONTRAK}} ({{NILAI_KONTRAK_TERBILANG}} rupiah)</w:t>
       </w:r>
       <w:r>
         <w:rPr>
@@ -10803,7 +10530,7 @@
           <w:color w:val="000000"/>
           <w:highlight w:val="yellow"/>
         </w:rPr>
-        <w:t>Rp. _____ (</w:t>
+        <w:t/>
       </w:r>
       <w:r>
         <w:rPr>
@@ -10812,7 +10539,7 @@
           <w:color w:val="000000"/>
           <w:highlight w:val="yellow"/>
         </w:rPr>
-        <w:t>____________</w:t>
+        <w:t/>
       </w:r>
       <w:r>
         <w:rPr>
@@ -10820,7 +10547,7 @@
           <w:color w:val="000000"/>
           <w:highlight w:val="yellow"/>
         </w:rPr>
-        <w:t xml:space="preserve"> rupiah)</w:t>
+        <w:t xml:space="preserve"/>
       </w:r>
       <w:r>
         <w:rPr>
@@ -10926,7 +10653,7 @@
           <w:rFonts w:ascii="Calibri Light" w:eastAsia="Calibri" w:hAnsi="Calibri Light" w:cs="Calibri Light"/>
           <w:color w:val="000000"/>
         </w:rPr>
-        <w:t xml:space="preserve">Termin pertama: Pembayaran sebesar </w:t>
+        <w:t xml:space="preserve">Termin pertama: Pembayaran sebesar {{TERMIN_1_PERSEN}}% ({{TERMIN_1_PERSEN_TERBILANG}} persen) dari Nilai Kontrak atau sebesar {{TERMIN_1_NILAI}} ({{TERMIN_1_NILAI_TERBILANG}} rupiah)</w:t>
       </w:r>
       <w:r>
         <w:rPr>
@@ -10934,14 +10661,14 @@
           <w:color w:val="000000"/>
           <w:highlight w:val="yellow"/>
         </w:rPr>
-        <w:t>**% (*** persen)</w:t>
-      </w:r>
-      <w:r>
-        <w:rPr>
-          <w:rFonts w:ascii="Calibri Light" w:eastAsia="Calibri" w:hAnsi="Calibri Light" w:cs="Calibri Light"/>
-          <w:color w:val="000000"/>
-        </w:rPr>
-        <w:t xml:space="preserve"> dari Nilai Kontrak atau sebesar  Rp _______ ( _______ rupiah) sudah termasuk pajak yang berlaku, </w:t>
+        <w:t/>
+      </w:r>
+      <w:r>
+        <w:rPr>
+          <w:rFonts w:ascii="Calibri Light" w:eastAsia="Calibri" w:hAnsi="Calibri Light" w:cs="Calibri Light"/>
+          <w:color w:val="000000"/>
+        </w:rPr>
+        <w:t xml:space="preserve"> sudah termasuk pajak yang berlaku, </w:t>
       </w:r>
       <w:bookmarkStart w:id="1" w:name="_Hlk213761728"/>
       <w:r>
@@ -10986,7 +10713,7 @@
           <w:rFonts w:ascii="Calibri Light" w:eastAsia="Calibri" w:hAnsi="Calibri Light" w:cs="Calibri Light"/>
           <w:color w:val="000000"/>
         </w:rPr>
-        <w:t xml:space="preserve">Termin kedua: Pembayaran sebesar </w:t>
+        <w:t xml:space="preserve">Termin kedua: Pembayaran sebesar {{TERMIN_2_PERSEN}}% ({{TERMIN_2_PERSEN_TERBILANG}} persen) dari Nilai Kontrak atau sebesar {{TERMIN_2_NILAI}} ({{TERMIN_2_NILAI_TERBILANG}} rupiah)</w:t>
       </w:r>
       <w:r>
         <w:rPr>
@@ -10994,14 +10721,14 @@
           <w:color w:val="000000"/>
           <w:highlight w:val="yellow"/>
         </w:rPr>
-        <w:t>**% (*** persen)</w:t>
-      </w:r>
-      <w:r>
-        <w:rPr>
-          <w:rFonts w:ascii="Calibri Light" w:eastAsia="Calibri" w:hAnsi="Calibri Light" w:cs="Calibri Light"/>
-          <w:color w:val="000000"/>
-        </w:rPr>
-        <w:t xml:space="preserve"> dari Nilai Kontrak atau sebesar Rp. ______ (_______ rupiah) sudah termasuk pajak yang berlaku, yang akan dibayarkan setelah penyampaian Hasil Laporan Pekerjaan dan Berita Acara Serah Terima Pekerjaan disetujui oleh PIHAK PERTAMA dan ditandatangani oleh PARA PIHAK.</w:t>
+        <w:t/>
+      </w:r>
+      <w:r>
+        <w:rPr>
+          <w:rFonts w:ascii="Calibri Light" w:eastAsia="Calibri" w:hAnsi="Calibri Light" w:cs="Calibri Light"/>
+          <w:color w:val="000000"/>
+        </w:rPr>
+        <w:t xml:space="preserve"> sudah termasuk pajak yang berlaku, yang akan dibayarkan setelah penyampaian Hasil Laporan Pekerjaan dan Berita Acara Serah Terima Pekerjaan disetujui oleh PIHAK PERTAMA dan ditandatangani oleh PARA PIHAK.</w:t>
       </w:r>
     </w:p>
     <w:p>
@@ -11049,35 +10776,17 @@
           <w:rFonts w:ascii="Calibri Light" w:eastAsia="Calibri" w:hAnsi="Calibri Light" w:cs="Calibri Light"/>
           <w:color w:val="000000"/>
         </w:rPr>
-      </w:pPr>
-      <w:r>
-        <w:rPr>
-          <w:rFonts w:ascii="Calibri Light" w:eastAsia="Calibri" w:hAnsi="Calibri Light" w:cs="Calibri Light"/>
-          <w:color w:val="000000"/>
-        </w:rPr>
+        <w:tabs>
+          <w:tab w:val="left" w:pos="2880"/>
+          <w:tab w:val="left" w:pos="3060"/>
+        </w:tabs>
+      </w:pPr>
+      <w:r>
         <w:t>Bank</w:t>
-      </w:r>
-      <w:r>
-        <w:rPr>
-          <w:rFonts w:ascii="Calibri Light" w:eastAsia="Calibri" w:hAnsi="Calibri Light" w:cs="Calibri Light"/>
-          <w:color w:val="000000"/>
-        </w:rPr>
-        <w:tab/>
-      </w:r>
-      <w:r>
-        <w:rPr>
-          <w:rFonts w:ascii="Calibri Light" w:eastAsia="Calibri" w:hAnsi="Calibri Light" w:cs="Calibri Light"/>
-          <w:color w:val="000000"/>
-        </w:rPr>
-        <w:tab/>
-      </w:r>
-      <w:r>
-        <w:rPr>
-          <w:rFonts w:ascii="Calibri Light" w:eastAsia="Calibri" w:hAnsi="Calibri Light" w:cs="Calibri Light"/>
-          <w:color w:val="000000"/>
-        </w:rPr>
         <w:tab/>
         <w:t>:</w:t>
+        <w:tab/>
+        <w:t>{{BANK}}</w:t>
       </w:r>
     </w:p>
     <w:p>
@@ -11096,21 +10805,17 @@
           <w:rFonts w:ascii="Calibri Light" w:eastAsia="Calibri" w:hAnsi="Calibri Light" w:cs="Calibri Light"/>
           <w:color w:val="000000"/>
         </w:rPr>
-      </w:pPr>
-      <w:r>
-        <w:rPr>
-          <w:rFonts w:ascii="Calibri Light" w:eastAsia="Calibri" w:hAnsi="Calibri Light" w:cs="Calibri Light"/>
-          <w:color w:val="000000"/>
-        </w:rPr>
+        <w:tabs>
+          <w:tab w:val="left" w:pos="2880"/>
+          <w:tab w:val="left" w:pos="3060"/>
+        </w:tabs>
+      </w:pPr>
+      <w:r>
         <w:t>Nomor Rekening</w:t>
-      </w:r>
-      <w:r>
-        <w:rPr>
-          <w:rFonts w:ascii="Calibri Light" w:eastAsia="Calibri" w:hAnsi="Calibri Light" w:cs="Calibri Light"/>
-          <w:color w:val="000000"/>
-        </w:rPr>
         <w:tab/>
         <w:t>:</w:t>
+        <w:tab/>
+        <w:t>{{NOMOR_REKENING}}</w:t>
       </w:r>
     </w:p>
     <w:p>
@@ -11129,28 +10834,17 @@
           <w:rFonts w:ascii="Calibri Light" w:eastAsia="Calibri" w:hAnsi="Calibri Light" w:cs="Calibri Light"/>
           <w:color w:val="000000"/>
         </w:rPr>
-      </w:pPr>
-      <w:r>
-        <w:rPr>
-          <w:rFonts w:ascii="Calibri Light" w:eastAsia="Calibri" w:hAnsi="Calibri Light" w:cs="Calibri Light"/>
-          <w:color w:val="000000"/>
-        </w:rPr>
+        <w:tabs>
+          <w:tab w:val="left" w:pos="2880"/>
+          <w:tab w:val="left" w:pos="3060"/>
+        </w:tabs>
+      </w:pPr>
+      <w:r>
         <w:t>Atas Nama</w:t>
-      </w:r>
-      <w:r>
-        <w:rPr>
-          <w:rFonts w:ascii="Calibri Light" w:eastAsia="Calibri" w:hAnsi="Calibri Light" w:cs="Calibri Light"/>
-          <w:color w:val="000000"/>
-        </w:rPr>
-        <w:tab/>
-      </w:r>
-      <w:r>
-        <w:rPr>
-          <w:rFonts w:ascii="Calibri Light" w:eastAsia="Calibri" w:hAnsi="Calibri Light" w:cs="Calibri Light"/>
-          <w:color w:val="000000"/>
-        </w:rPr>
         <w:tab/>
         <w:t>:</w:t>
+        <w:tab/>
+        <w:t>{{ATAS_NAMA}}</w:t>
       </w:r>
     </w:p>
     <w:p>
@@ -11353,660 +11047,304 @@
           <w:color w:val="000000"/>
           <w:highlight w:val="yellow"/>
         </w:rPr>
-      </w:pPr>
-      <w:r>
-        <w:rPr>
-          <w:rFonts w:ascii="Calibri Light" w:eastAsia="Calibri" w:hAnsi="Calibri Light" w:cs="Calibri Light"/>
-          <w:color w:val="000000"/>
-          <w:highlight w:val="yellow"/>
-        </w:rPr>
+        <w:tabs>
+          <w:tab w:val="left" w:pos="1800"/>
+          <w:tab w:val="left" w:pos="1980"/>
+        </w:tabs>
+      </w:pPr>
+      <w:r>
         <w:t>Alamat</w:t>
-      </w:r>
-      <w:r>
-        <w:rPr>
-          <w:rFonts w:ascii="Calibri Light" w:eastAsia="Calibri" w:hAnsi="Calibri Light" w:cs="Calibri Light"/>
-          <w:color w:val="000000"/>
-          <w:highlight w:val="yellow"/>
-        </w:rPr>
-        <w:tab/>
-      </w:r>
-      <w:r>
-        <w:rPr>
-          <w:rFonts w:ascii="Calibri Light" w:eastAsia="Calibri" w:hAnsi="Calibri Light" w:cs="Calibri Light"/>
-          <w:color w:val="000000"/>
-          <w:highlight w:val="yellow"/>
-        </w:rPr>
-        <w:tab/>
-        <w:t>: Jl. Salemba Raya No. 30 Kenari Selatan, Jakarta Pusat</w:t>
-      </w:r>
-    </w:p>
-    <w:p>
-      <w:pPr>
-        <w:pBdr>
-          <w:top w:val="nil"/>
-          <w:left w:val="nil"/>
-          <w:bottom w:val="nil"/>
-          <w:right w:val="nil"/>
-          <w:between w:val="nil"/>
-        </w:pBdr>
-        <w:spacing w:line="276" w:lineRule="auto"/>
-        <w:ind w:left="360"/>
-        <w:rPr>
-          <w:rFonts w:ascii="Calibri Light" w:eastAsia="Calibri" w:hAnsi="Calibri Light" w:cs="Calibri Light"/>
-          <w:color w:val="000000"/>
-          <w:highlight w:val="yellow"/>
-        </w:rPr>
-      </w:pPr>
-      <w:r>
-        <w:rPr>
-          <w:rFonts w:ascii="Calibri Light" w:eastAsia="Calibri" w:hAnsi="Calibri Light" w:cs="Calibri Light"/>
-          <w:color w:val="000000"/>
-          <w:highlight w:val="yellow"/>
-        </w:rPr>
-        <w:t>Telepon</w:t>
-      </w:r>
-      <w:r>
-        <w:rPr>
-          <w:rFonts w:ascii="Calibri Light" w:eastAsia="Calibri" w:hAnsi="Calibri Light" w:cs="Calibri Light"/>
-          <w:color w:val="000000"/>
-          <w:highlight w:val="yellow"/>
-        </w:rPr>
-        <w:tab/>
-      </w:r>
-      <w:r>
-        <w:rPr>
-          <w:rFonts w:ascii="Calibri Light" w:eastAsia="Calibri" w:hAnsi="Calibri Light" w:cs="Calibri Light"/>
-          <w:color w:val="000000"/>
-          <w:highlight w:val="yellow"/>
-        </w:rPr>
-        <w:tab/>
-        <w:t>: 021 3920101</w:t>
-      </w:r>
-    </w:p>
-    <w:p>
-      <w:pPr>
-        <w:pBdr>
-          <w:top w:val="nil"/>
-          <w:left w:val="nil"/>
-          <w:bottom w:val="nil"/>
-          <w:right w:val="nil"/>
-          <w:between w:val="nil"/>
-        </w:pBdr>
-        <w:spacing w:line="276" w:lineRule="auto"/>
-        <w:ind w:left="360"/>
-        <w:rPr>
-          <w:rFonts w:ascii="Calibri Light" w:eastAsia="Calibri" w:hAnsi="Calibri Light" w:cs="Calibri Light"/>
-          <w:color w:val="000000"/>
-          <w:highlight w:val="yellow"/>
-        </w:rPr>
-      </w:pPr>
-      <w:r>
-        <w:rPr>
-          <w:rFonts w:ascii="Calibri Light" w:eastAsia="Calibri" w:hAnsi="Calibri Light" w:cs="Calibri Light"/>
-          <w:color w:val="000000"/>
-          <w:highlight w:val="yellow"/>
-        </w:rPr>
-        <w:t>e-mail</w:t>
-      </w:r>
-      <w:r>
-        <w:rPr>
-          <w:rFonts w:ascii="Calibri Light" w:eastAsia="Calibri" w:hAnsi="Calibri Light" w:cs="Calibri Light"/>
-          <w:color w:val="000000"/>
-          <w:highlight w:val="yellow"/>
-        </w:rPr>
-        <w:tab/>
-      </w:r>
-      <w:r>
-        <w:rPr>
-          <w:rFonts w:ascii="Calibri Light" w:eastAsia="Calibri" w:hAnsi="Calibri Light" w:cs="Calibri Light"/>
-          <w:color w:val="000000"/>
-          <w:highlight w:val="yellow"/>
-        </w:rPr>
-        <w:tab/>
-        <w:t xml:space="preserve">: </w:t>
-      </w:r>
-    </w:p>
-    <w:p>
-      <w:pPr>
-        <w:pBdr>
-          <w:top w:val="nil"/>
-          <w:left w:val="nil"/>
-          <w:bottom w:val="nil"/>
-          <w:right w:val="nil"/>
-          <w:between w:val="nil"/>
-        </w:pBdr>
-        <w:spacing w:line="276" w:lineRule="auto"/>
-        <w:ind w:left="360"/>
-        <w:rPr>
-          <w:rFonts w:ascii="Calibri Light" w:eastAsia="Calibri" w:hAnsi="Calibri Light" w:cs="Calibri Light"/>
-          <w:color w:val="000000"/>
-        </w:rPr>
-      </w:pPr>
-      <w:r>
-        <w:rPr>
-          <w:rFonts w:ascii="Calibri Light" w:eastAsia="Calibri" w:hAnsi="Calibri Light" w:cs="Calibri Light"/>
-          <w:color w:val="000000"/>
-          <w:highlight w:val="yellow"/>
-        </w:rPr>
-        <w:t>PIC</w:t>
-      </w:r>
-      <w:r>
-        <w:rPr>
-          <w:rFonts w:ascii="Calibri Light" w:eastAsia="Calibri" w:hAnsi="Calibri Light" w:cs="Calibri Light"/>
-          <w:color w:val="000000"/>
-          <w:highlight w:val="yellow"/>
-        </w:rPr>
-        <w:tab/>
-      </w:r>
-      <w:r>
-        <w:rPr>
-          <w:rFonts w:ascii="Calibri Light" w:eastAsia="Calibri" w:hAnsi="Calibri Light" w:cs="Calibri Light"/>
-          <w:color w:val="000000"/>
-          <w:highlight w:val="yellow"/>
-        </w:rPr>
-        <w:tab/>
-      </w:r>
-      <w:r>
-        <w:rPr>
-          <w:rFonts w:ascii="Calibri Light" w:eastAsia="Calibri" w:hAnsi="Calibri Light" w:cs="Calibri Light"/>
-          <w:color w:val="000000"/>
-          <w:highlight w:val="yellow"/>
-        </w:rPr>
         <w:tab/>
         <w:t>:</w:t>
-      </w:r>
-      <w:r>
-        <w:rPr>
-          <w:rFonts w:ascii="Calibri Light" w:eastAsia="Calibri" w:hAnsi="Calibri Light" w:cs="Calibri Light"/>
-          <w:color w:val="000000"/>
-        </w:rPr>
-        <w:t xml:space="preserve"> </w:t>
-      </w:r>
-    </w:p>
-    <w:p>
-      <w:pPr>
-        <w:pBdr>
-          <w:top w:val="nil"/>
-          <w:left w:val="nil"/>
-          <w:bottom w:val="nil"/>
-          <w:right w:val="nil"/>
-          <w:between w:val="nil"/>
-        </w:pBdr>
-        <w:spacing w:line="276" w:lineRule="auto"/>
-        <w:ind w:left="283"/>
-        <w:rPr>
-          <w:rFonts w:ascii="Calibri Light" w:eastAsia="Calibri" w:hAnsi="Calibri Light" w:cs="Calibri Light"/>
-          <w:color w:val="000000"/>
-        </w:rPr>
-      </w:pPr>
-    </w:p>
-    <w:p>
-      <w:pPr>
-        <w:pBdr>
-          <w:top w:val="nil"/>
-          <w:left w:val="nil"/>
-          <w:bottom w:val="nil"/>
-          <w:right w:val="nil"/>
-          <w:between w:val="nil"/>
-        </w:pBdr>
-        <w:spacing w:line="276" w:lineRule="auto"/>
-        <w:ind w:left="308"/>
-        <w:rPr>
-          <w:rFonts w:ascii="Calibri Light" w:eastAsia="Calibri" w:hAnsi="Calibri Light" w:cs="Calibri Light"/>
-          <w:b/>
+        <w:tab/>
+        <w:t>{{PIHAK_PERTAMA_ALAMAT}}</w:t>
+      </w:r>
+    </w:p>
+    <w:p>
+      <w:pPr>
+        <w:pBdr>
+          <w:top w:val="nil"/>
+          <w:left w:val="nil"/>
+          <w:bottom w:val="nil"/>
+          <w:right w:val="nil"/>
+          <w:between w:val="nil"/>
+        </w:pBdr>
+        <w:spacing w:line="276" w:lineRule="auto"/>
+        <w:ind w:left="360"/>
+        <w:rPr>
+          <w:rFonts w:ascii="Calibri Light" w:eastAsia="Calibri" w:hAnsi="Calibri Light" w:cs="Calibri Light"/>
           <w:color w:val="000000"/>
           <w:highlight w:val="yellow"/>
         </w:rPr>
-      </w:pPr>
-      <w:r>
-        <w:rPr>
-          <w:rFonts w:ascii="Calibri Light" w:eastAsia="Calibri" w:hAnsi="Calibri Light" w:cs="Calibri Light"/>
-          <w:b/>
-          <w:color w:val="000000"/>
-        </w:rPr>
-        <w:t xml:space="preserve"> </w:t>
-      </w:r>
-      <w:r>
-        <w:rPr>
-          <w:rFonts w:ascii="Calibri Light" w:eastAsia="Calibri" w:hAnsi="Calibri Light" w:cs="Calibri Light"/>
-          <w:b/>
-          <w:color w:val="000000"/>
-          <w:highlight w:val="yellow"/>
-        </w:rPr>
-        <w:t>PIHAK KEDUA</w:t>
-      </w:r>
-    </w:p>
-    <w:p>
-      <w:pPr>
-        <w:pBdr>
-          <w:top w:val="nil"/>
-          <w:left w:val="nil"/>
-          <w:bottom w:val="nil"/>
-          <w:right w:val="nil"/>
-          <w:between w:val="nil"/>
-        </w:pBdr>
-        <w:spacing w:line="276" w:lineRule="auto"/>
-        <w:ind w:left="308" w:firstLine="77"/>
-        <w:rPr>
-          <w:rFonts w:ascii="Calibri Light" w:eastAsia="Calibri" w:hAnsi="Calibri Light" w:cs="Calibri Light"/>
-          <w:b/>
-          <w:color w:val="000000"/>
-          <w:highlight w:val="yellow"/>
-        </w:rPr>
-      </w:pPr>
-      <w:r>
-        <w:rPr>
-          <w:rFonts w:ascii="Calibri Light" w:eastAsia="Calibri" w:hAnsi="Calibri Light" w:cs="Calibri Light"/>
-          <w:b/>
-          <w:color w:val="000000"/>
-          <w:highlight w:val="yellow"/>
-        </w:rPr>
-        <w:t>________________________</w:t>
-      </w:r>
-    </w:p>
-    <w:p>
-      <w:pPr>
-        <w:pBdr>
-          <w:top w:val="nil"/>
-          <w:left w:val="nil"/>
-          <w:bottom w:val="nil"/>
-          <w:right w:val="nil"/>
-          <w:between w:val="nil"/>
-        </w:pBdr>
-        <w:spacing w:line="276" w:lineRule="auto"/>
-        <w:ind w:left="745" w:hanging="360"/>
-        <w:rPr>
-          <w:rFonts w:ascii="Calibri Light" w:eastAsia="Calibri" w:hAnsi="Calibri Light" w:cs="Calibri Light"/>
-          <w:color w:val="000000"/>
-          <w:highlight w:val="yellow"/>
-        </w:rPr>
-      </w:pPr>
-      <w:r>
-        <w:rPr>
-          <w:rFonts w:ascii="Calibri Light" w:eastAsia="Calibri" w:hAnsi="Calibri Light" w:cs="Calibri Light"/>
-          <w:color w:val="000000"/>
-          <w:highlight w:val="yellow"/>
-        </w:rPr>
-        <w:t>Alamat</w:t>
-      </w:r>
-      <w:r>
-        <w:rPr>
-          <w:rFonts w:ascii="Calibri Light" w:eastAsia="Calibri" w:hAnsi="Calibri Light" w:cs="Calibri Light"/>
-          <w:color w:val="000000"/>
-          <w:highlight w:val="yellow"/>
-        </w:rPr>
-        <w:tab/>
-      </w:r>
-      <w:r>
-        <w:rPr>
-          <w:rFonts w:ascii="Calibri Light" w:eastAsia="Calibri" w:hAnsi="Calibri Light" w:cs="Calibri Light"/>
-          <w:color w:val="000000"/>
-          <w:highlight w:val="yellow"/>
-        </w:rPr>
-        <w:tab/>
-        <w:t xml:space="preserve">: </w:t>
-      </w:r>
-    </w:p>
-    <w:p>
-      <w:pPr>
-        <w:pBdr>
-          <w:top w:val="nil"/>
-          <w:left w:val="nil"/>
-          <w:bottom w:val="nil"/>
-          <w:right w:val="nil"/>
-          <w:between w:val="nil"/>
-        </w:pBdr>
-        <w:spacing w:line="276" w:lineRule="auto"/>
-        <w:ind w:left="745" w:hanging="360"/>
-        <w:rPr>
-          <w:rFonts w:ascii="Calibri Light" w:eastAsia="Calibri" w:hAnsi="Calibri Light" w:cs="Calibri Light"/>
-          <w:color w:val="000000"/>
-          <w:highlight w:val="yellow"/>
-        </w:rPr>
-      </w:pPr>
-      <w:r>
-        <w:rPr>
-          <w:rFonts w:ascii="Calibri Light" w:eastAsia="Calibri" w:hAnsi="Calibri Light" w:cs="Calibri Light"/>
-          <w:color w:val="000000"/>
-          <w:highlight w:val="yellow"/>
-        </w:rPr>
+        <w:tabs>
+          <w:tab w:val="left" w:pos="1800"/>
+          <w:tab w:val="left" w:pos="1980"/>
+        </w:tabs>
+      </w:pPr>
+      <w:r>
         <w:t>Telepon</w:t>
-      </w:r>
-      <w:r>
-        <w:rPr>
-          <w:rFonts w:ascii="Calibri Light" w:eastAsia="Calibri" w:hAnsi="Calibri Light" w:cs="Calibri Light"/>
-          <w:color w:val="000000"/>
-          <w:highlight w:val="yellow"/>
-        </w:rPr>
-        <w:tab/>
-      </w:r>
-      <w:r>
-        <w:rPr>
-          <w:rFonts w:ascii="Calibri Light" w:eastAsia="Calibri" w:hAnsi="Calibri Light" w:cs="Calibri Light"/>
-          <w:color w:val="000000"/>
-          <w:highlight w:val="yellow"/>
-        </w:rPr>
-        <w:tab/>
-        <w:t xml:space="preserve">: </w:t>
-      </w:r>
-    </w:p>
-    <w:p>
-      <w:pPr>
-        <w:pBdr>
-          <w:top w:val="nil"/>
-          <w:left w:val="nil"/>
-          <w:bottom w:val="nil"/>
-          <w:right w:val="nil"/>
-          <w:between w:val="nil"/>
-        </w:pBdr>
-        <w:spacing w:line="276" w:lineRule="auto"/>
-        <w:ind w:left="745" w:hanging="360"/>
-        <w:rPr>
-          <w:rFonts w:ascii="Calibri Light" w:eastAsia="Calibri" w:hAnsi="Calibri Light" w:cs="Calibri Light"/>
-          <w:color w:val="000000"/>
-          <w:highlight w:val="yellow"/>
-        </w:rPr>
-      </w:pPr>
-      <w:r>
-        <w:rPr>
-          <w:rFonts w:ascii="Calibri Light" w:eastAsia="Calibri" w:hAnsi="Calibri Light" w:cs="Calibri Light"/>
-          <w:color w:val="000000"/>
-          <w:highlight w:val="yellow"/>
-        </w:rPr>
-        <w:t>e-mail</w:t>
-      </w:r>
-      <w:r>
-        <w:rPr>
-          <w:rFonts w:ascii="Calibri Light" w:eastAsia="Calibri" w:hAnsi="Calibri Light" w:cs="Calibri Light"/>
-          <w:color w:val="000000"/>
-          <w:highlight w:val="yellow"/>
-        </w:rPr>
-        <w:tab/>
-      </w:r>
-      <w:r>
-        <w:rPr>
-          <w:rFonts w:ascii="Calibri Light" w:eastAsia="Calibri" w:hAnsi="Calibri Light" w:cs="Calibri Light"/>
-          <w:color w:val="000000"/>
-          <w:highlight w:val="yellow"/>
-        </w:rPr>
-        <w:tab/>
-        <w:t xml:space="preserve">: </w:t>
-      </w:r>
-    </w:p>
-    <w:p>
-      <w:pPr>
-        <w:pBdr>
-          <w:top w:val="nil"/>
-          <w:left w:val="nil"/>
-          <w:bottom w:val="nil"/>
-          <w:right w:val="nil"/>
-          <w:between w:val="nil"/>
-        </w:pBdr>
-        <w:spacing w:line="276" w:lineRule="auto"/>
-        <w:ind w:left="745" w:hanging="360"/>
-        <w:rPr>
-          <w:rFonts w:ascii="Calibri Light" w:eastAsia="Calibri" w:hAnsi="Calibri Light" w:cs="Calibri Light"/>
-          <w:color w:val="000000"/>
-        </w:rPr>
-      </w:pPr>
-      <w:r>
-        <w:rPr>
-          <w:rFonts w:ascii="Calibri Light" w:eastAsia="Calibri" w:hAnsi="Calibri Light" w:cs="Calibri Light"/>
-          <w:color w:val="000000"/>
-          <w:highlight w:val="yellow"/>
-        </w:rPr>
-        <w:t>PIC</w:t>
-      </w:r>
-      <w:r>
-        <w:rPr>
-          <w:rFonts w:ascii="Calibri Light" w:eastAsia="Calibri" w:hAnsi="Calibri Light" w:cs="Calibri Light"/>
-          <w:color w:val="000000"/>
-          <w:highlight w:val="yellow"/>
-        </w:rPr>
-        <w:tab/>
-      </w:r>
-      <w:r>
-        <w:rPr>
-          <w:rFonts w:ascii="Calibri Light" w:eastAsia="Calibri" w:hAnsi="Calibri Light" w:cs="Calibri Light"/>
-          <w:color w:val="000000"/>
-          <w:highlight w:val="yellow"/>
-        </w:rPr>
-        <w:tab/>
-      </w:r>
-      <w:r>
-        <w:rPr>
-          <w:rFonts w:ascii="Calibri Light" w:eastAsia="Calibri" w:hAnsi="Calibri Light" w:cs="Calibri Light"/>
-          <w:color w:val="000000"/>
-          <w:highlight w:val="yellow"/>
-        </w:rPr>
         <w:tab/>
         <w:t>:</w:t>
-      </w:r>
-      <w:r>
-        <w:rPr>
-          <w:rFonts w:ascii="Calibri Light" w:eastAsia="Calibri" w:hAnsi="Calibri Light" w:cs="Calibri Light"/>
+        <w:tab/>
+        <w:t>{{PIHAK_PERTAMA_TELEPON}}</w:t>
+      </w:r>
+    </w:p>
+    <w:p>
+      <w:pPr>
+        <w:pBdr>
+          <w:top w:val="nil"/>
+          <w:left w:val="nil"/>
+          <w:bottom w:val="nil"/>
+          <w:right w:val="nil"/>
+          <w:between w:val="nil"/>
+        </w:pBdr>
+        <w:spacing w:line="276" w:lineRule="auto"/>
+        <w:ind w:left="360"/>
+        <w:rPr>
+          <w:rFonts w:ascii="Calibri Light" w:eastAsia="Calibri" w:hAnsi="Calibri Light" w:cs="Calibri Light"/>
+          <w:color w:val="000000"/>
+          <w:highlight w:val="yellow"/>
+        </w:rPr>
+        <w:tabs>
+          <w:tab w:val="left" w:pos="1800"/>
+          <w:tab w:val="left" w:pos="1980"/>
+        </w:tabs>
+      </w:pPr>
+      <w:r>
+        <w:t>E-mail</w:t>
+        <w:tab/>
+        <w:t>:</w:t>
+        <w:tab/>
+        <w:t>{{PIHAK_PERTAMA_EMAIL}}</w:t>
+      </w:r>
+    </w:p>
+    <w:p>
+      <w:pPr>
+        <w:pBdr>
+          <w:top w:val="nil"/>
+          <w:left w:val="nil"/>
+          <w:bottom w:val="nil"/>
+          <w:right w:val="nil"/>
+          <w:between w:val="nil"/>
+        </w:pBdr>
+        <w:spacing w:line="276" w:lineRule="auto"/>
+        <w:ind w:left="360"/>
+        <w:rPr>
+          <w:rFonts w:ascii="Calibri Light" w:eastAsia="Calibri" w:hAnsi="Calibri Light" w:cs="Calibri Light"/>
+          <w:color w:val="000000"/>
+        </w:rPr>
+        <w:tabs>
+          <w:tab w:val="left" w:pos="1800"/>
+          <w:tab w:val="left" w:pos="1980"/>
+        </w:tabs>
+      </w:pPr>
+      <w:r>
+        <w:t>PIC</w:t>
+        <w:tab/>
+        <w:t>:</w:t>
+        <w:tab/>
+        <w:t>{{PIHAK_PERTAMA_PIC}}</w:t>
+      </w:r>
+    </w:p>
+    <w:p>
+      <w:pPr>
+        <w:pBdr>
+          <w:top w:val="nil"/>
+          <w:left w:val="nil"/>
+          <w:bottom w:val="nil"/>
+          <w:right w:val="nil"/>
+          <w:between w:val="nil"/>
+        </w:pBdr>
+        <w:spacing w:line="276" w:lineRule="auto"/>
+        <w:ind w:left="283"/>
+        <w:rPr>
+          <w:rFonts w:ascii="Calibri Light" w:eastAsia="Calibri" w:hAnsi="Calibri Light" w:cs="Calibri Light"/>
+          <w:color w:val="000000"/>
+        </w:rPr>
+      </w:pPr>
+    </w:p>
+    <w:p>
+      <w:pPr>
+        <w:pBdr>
+          <w:top w:val="nil"/>
+          <w:left w:val="nil"/>
+          <w:bottom w:val="nil"/>
+          <w:right w:val="nil"/>
+          <w:between w:val="nil"/>
+        </w:pBdr>
+        <w:spacing w:line="276" w:lineRule="auto"/>
+        <w:ind w:left="308"/>
+        <w:rPr>
+          <w:rFonts w:ascii="Calibri Light" w:eastAsia="Calibri" w:hAnsi="Calibri Light" w:cs="Calibri Light"/>
+          <w:b/>
+          <w:color w:val="000000"/>
+          <w:highlight w:val="yellow"/>
+        </w:rPr>
+      </w:pPr>
+      <w:r>
+        <w:rPr>
+          <w:rFonts w:ascii="Calibri Light" w:eastAsia="Calibri" w:hAnsi="Calibri Light" w:cs="Calibri Light"/>
+          <w:b/>
           <w:color w:val="000000"/>
         </w:rPr>
         <w:t xml:space="preserve"> </w:t>
       </w:r>
-    </w:p>
-    <w:p>
-      <w:pPr>
-        <w:pBdr>
-          <w:top w:val="nil"/>
-          <w:left w:val="nil"/>
-          <w:bottom w:val="nil"/>
-          <w:right w:val="nil"/>
-          <w:between w:val="nil"/>
-        </w:pBdr>
-        <w:spacing w:line="276" w:lineRule="auto"/>
-        <w:ind w:left="797" w:hanging="360"/>
-        <w:rPr>
-          <w:rFonts w:ascii="Calibri Light" w:eastAsia="Calibri" w:hAnsi="Calibri Light" w:cs="Calibri Light"/>
-          <w:color w:val="000000"/>
-        </w:rPr>
-      </w:pPr>
-    </w:p>
-    <w:p>
-      <w:pPr>
-        <w:spacing w:line="276" w:lineRule="auto"/>
-        <w:jc w:val="center"/>
-        <w:rPr>
-          <w:rFonts w:ascii="Calibri Light" w:eastAsia="Calibri" w:hAnsi="Calibri Light" w:cs="Calibri Light"/>
-        </w:rPr>
-      </w:pPr>
-    </w:p>
-    <w:p>
-      <w:pPr>
-        <w:spacing w:line="276" w:lineRule="auto"/>
-        <w:jc w:val="center"/>
-        <w:rPr>
-          <w:rFonts w:ascii="Calibri Light" w:eastAsia="Calibri" w:hAnsi="Calibri Light" w:cs="Calibri Light"/>
-        </w:rPr>
-      </w:pPr>
-    </w:p>
-    <w:p>
-      <w:pPr>
-        <w:spacing w:line="276" w:lineRule="auto"/>
-        <w:jc w:val="center"/>
+      <w:r>
         <w:rPr>
           <w:rFonts w:ascii="Calibri Light" w:eastAsia="Calibri" w:hAnsi="Calibri Light" w:cs="Calibri Light"/>
           <w:b/>
-        </w:rPr>
-      </w:pPr>
-    </w:p>
-    <w:p>
-      <w:pPr>
-        <w:spacing w:line="276" w:lineRule="auto"/>
-        <w:jc w:val="center"/>
+          <w:color w:val="000000"/>
+          <w:highlight w:val="yellow"/>
+        </w:rPr>
+        <w:t>PIHAK KEDUA</w:t>
+      </w:r>
+    </w:p>
+    <w:p>
+      <w:pPr>
+        <w:pBdr>
+          <w:top w:val="nil"/>
+          <w:left w:val="nil"/>
+          <w:bottom w:val="nil"/>
+          <w:right w:val="nil"/>
+          <w:between w:val="nil"/>
+        </w:pBdr>
+        <w:spacing w:line="276" w:lineRule="auto"/>
+        <w:ind w:left="308" w:firstLine="77"/>
         <w:rPr>
           <w:rFonts w:ascii="Calibri Light" w:eastAsia="Calibri" w:hAnsi="Calibri Light" w:cs="Calibri Light"/>
           <w:b/>
-        </w:rPr>
-      </w:pPr>
-    </w:p>
-    <w:p>
-      <w:pPr>
-        <w:spacing w:line="276" w:lineRule="auto"/>
-        <w:jc w:val="center"/>
+          <w:color w:val="000000"/>
+          <w:highlight w:val="yellow"/>
+        </w:rPr>
+      </w:pPr>
+      <w:r>
         <w:rPr>
           <w:rFonts w:ascii="Calibri Light" w:eastAsia="Calibri" w:hAnsi="Calibri Light" w:cs="Calibri Light"/>
           <w:b/>
-        </w:rPr>
-      </w:pPr>
-    </w:p>
-    <w:p>
-      <w:pPr>
-        <w:spacing w:line="276" w:lineRule="auto"/>
-        <w:jc w:val="center"/>
-        <w:rPr>
-          <w:rFonts w:ascii="Calibri Light" w:eastAsia="Calibri" w:hAnsi="Calibri Light" w:cs="Calibri Light"/>
-          <w:b/>
-        </w:rPr>
-      </w:pPr>
-    </w:p>
-    <w:p>
-      <w:pPr>
-        <w:spacing w:line="276" w:lineRule="auto"/>
-        <w:jc w:val="center"/>
-        <w:rPr>
-          <w:rFonts w:ascii="Calibri Light" w:eastAsia="Calibri" w:hAnsi="Calibri Light" w:cs="Calibri Light"/>
-          <w:b/>
-        </w:rPr>
-      </w:pPr>
-    </w:p>
-    <w:p>
-      <w:pPr>
-        <w:spacing w:line="276" w:lineRule="auto"/>
-        <w:jc w:val="center"/>
-        <w:rPr>
-          <w:rFonts w:ascii="Calibri Light" w:eastAsia="Calibri" w:hAnsi="Calibri Light" w:cs="Calibri Light"/>
-          <w:b/>
-        </w:rPr>
-      </w:pPr>
-    </w:p>
-    <w:p>
-      <w:pPr>
-        <w:spacing w:line="276" w:lineRule="auto"/>
-        <w:jc w:val="center"/>
-        <w:rPr>
-          <w:rFonts w:ascii="Calibri Light" w:eastAsia="Calibri" w:hAnsi="Calibri Light" w:cs="Calibri Light"/>
-          <w:b/>
-        </w:rPr>
-      </w:pPr>
-    </w:p>
-    <w:p>
-      <w:pPr>
-        <w:spacing w:line="276" w:lineRule="auto"/>
-        <w:jc w:val="center"/>
-        <w:rPr>
-          <w:rFonts w:ascii="Calibri Light" w:eastAsia="Calibri" w:hAnsi="Calibri Light" w:cs="Calibri Light"/>
-          <w:b/>
-        </w:rPr>
-      </w:pPr>
-    </w:p>
-    <w:p>
-      <w:pPr>
-        <w:spacing w:line="276" w:lineRule="auto"/>
-        <w:jc w:val="center"/>
-        <w:rPr>
-          <w:rFonts w:ascii="Calibri Light" w:eastAsia="Calibri" w:hAnsi="Calibri Light" w:cs="Calibri Light"/>
-          <w:b/>
-        </w:rPr>
-      </w:pPr>
-    </w:p>
-    <w:p>
-      <w:pPr>
-        <w:spacing w:line="276" w:lineRule="auto"/>
-        <w:jc w:val="center"/>
-        <w:rPr>
-          <w:rFonts w:ascii="Calibri Light" w:eastAsia="Calibri" w:hAnsi="Calibri Light" w:cs="Calibri Light"/>
-          <w:b/>
-        </w:rPr>
-      </w:pPr>
-    </w:p>
-    <w:p>
-      <w:pPr>
-        <w:spacing w:line="276" w:lineRule="auto"/>
-        <w:jc w:val="center"/>
-        <w:rPr>
-          <w:rFonts w:ascii="Calibri Light" w:eastAsia="Calibri" w:hAnsi="Calibri Light" w:cs="Calibri Light"/>
-          <w:b/>
-        </w:rPr>
-      </w:pPr>
-    </w:p>
-    <w:p>
-      <w:pPr>
-        <w:spacing w:line="276" w:lineRule="auto"/>
-        <w:jc w:val="center"/>
-        <w:rPr>
-          <w:rFonts w:ascii="Calibri Light" w:eastAsia="Calibri" w:hAnsi="Calibri Light" w:cs="Calibri Light"/>
-          <w:b/>
-        </w:rPr>
-      </w:pPr>
-    </w:p>
-    <w:p>
-      <w:pPr>
-        <w:spacing w:line="276" w:lineRule="auto"/>
-        <w:jc w:val="center"/>
-        <w:rPr>
-          <w:rFonts w:ascii="Calibri Light" w:eastAsia="Calibri" w:hAnsi="Calibri Light" w:cs="Calibri Light"/>
-          <w:b/>
-        </w:rPr>
-      </w:pPr>
-    </w:p>
-    <w:p>
-      <w:pPr>
-        <w:spacing w:line="276" w:lineRule="auto"/>
-        <w:jc w:val="center"/>
-        <w:rPr>
-          <w:rFonts w:ascii="Calibri Light" w:eastAsia="Calibri" w:hAnsi="Calibri Light" w:cs="Calibri Light"/>
-          <w:b/>
-        </w:rPr>
-      </w:pPr>
-    </w:p>
-    <w:p>
-      <w:pPr>
-        <w:spacing w:line="276" w:lineRule="auto"/>
-        <w:jc w:val="center"/>
-        <w:rPr>
-          <w:rFonts w:ascii="Calibri Light" w:eastAsia="Calibri" w:hAnsi="Calibri Light" w:cs="Calibri Light"/>
-          <w:b/>
-        </w:rPr>
-      </w:pPr>
-    </w:p>
-    <w:p>
-      <w:pPr>
-        <w:spacing w:line="276" w:lineRule="auto"/>
-        <w:jc w:val="center"/>
-        <w:rPr>
-          <w:rFonts w:ascii="Calibri Light" w:eastAsia="Calibri" w:hAnsi="Calibri Light" w:cs="Calibri Light"/>
-          <w:b/>
-        </w:rPr>
-      </w:pPr>
-    </w:p>
-    <w:p>
-      <w:pPr>
-        <w:spacing w:line="276" w:lineRule="auto"/>
-        <w:jc w:val="center"/>
-        <w:rPr>
-          <w:rFonts w:ascii="Calibri Light" w:eastAsia="Calibri" w:hAnsi="Calibri Light" w:cs="Calibri Light"/>
-          <w:b/>
-        </w:rPr>
-      </w:pPr>
-    </w:p>
-    <w:p>
-      <w:pPr>
-        <w:spacing w:line="276" w:lineRule="auto"/>
-        <w:jc w:val="center"/>
-        <w:rPr>
-          <w:rFonts w:ascii="Calibri Light" w:eastAsia="Calibri" w:hAnsi="Calibri Light" w:cs="Calibri Light"/>
-          <w:b/>
-        </w:rPr>
-      </w:pPr>
-    </w:p>
-    <w:p>
-      <w:pPr>
+          <w:color w:val="000000"/>
+          <w:highlight w:val="yellow"/>
+        </w:rPr>
+        <w:t>{{PIHAK_KEDUA_NAMA}}</w:t>
+      </w:r>
+    </w:p>
+    <w:p>
+      <w:pPr>
+        <w:pBdr>
+          <w:top w:val="nil"/>
+          <w:left w:val="nil"/>
+          <w:bottom w:val="nil"/>
+          <w:right w:val="nil"/>
+          <w:between w:val="nil"/>
+        </w:pBdr>
+        <w:spacing w:line="276" w:lineRule="auto"/>
+        <w:ind w:left="745" w:hanging="360"/>
+        <w:rPr>
+          <w:rFonts w:ascii="Calibri Light" w:eastAsia="Calibri" w:hAnsi="Calibri Light" w:cs="Calibri Light"/>
+          <w:color w:val="000000"/>
+          <w:highlight w:val="yellow"/>
+        </w:rPr>
+        <w:tabs>
+          <w:tab w:val="left" w:pos="1800"/>
+          <w:tab w:val="left" w:pos="1980"/>
+        </w:tabs>
+      </w:pPr>
+      <w:r>
+        <w:t>Alamat</w:t>
+        <w:tab/>
+        <w:t>:</w:t>
+        <w:tab/>
+        <w:t>{{PIHAK_KEDUA_ALAMAT}}</w:t>
+      </w:r>
+    </w:p>
+    <w:p>
+      <w:pPr>
+        <w:pBdr>
+          <w:top w:val="nil"/>
+          <w:left w:val="nil"/>
+          <w:bottom w:val="nil"/>
+          <w:right w:val="nil"/>
+          <w:between w:val="nil"/>
+        </w:pBdr>
+        <w:spacing w:line="276" w:lineRule="auto"/>
+        <w:ind w:left="745" w:hanging="360"/>
+        <w:rPr>
+          <w:rFonts w:ascii="Calibri Light" w:eastAsia="Calibri" w:hAnsi="Calibri Light" w:cs="Calibri Light"/>
+          <w:color w:val="000000"/>
+          <w:highlight w:val="yellow"/>
+        </w:rPr>
+        <w:tabs>
+          <w:tab w:val="left" w:pos="1800"/>
+          <w:tab w:val="left" w:pos="1980"/>
+        </w:tabs>
+      </w:pPr>
+      <w:r>
+        <w:t>Telepon</w:t>
+        <w:tab/>
+        <w:t>:</w:t>
+        <w:tab/>
+        <w:t>{{PIHAK_KEDUA_TELEPON}}</w:t>
+      </w:r>
+    </w:p>
+    <w:p>
+      <w:pPr>
+        <w:pBdr>
+          <w:top w:val="nil"/>
+          <w:left w:val="nil"/>
+          <w:bottom w:val="nil"/>
+          <w:right w:val="nil"/>
+          <w:between w:val="nil"/>
+        </w:pBdr>
+        <w:spacing w:line="276" w:lineRule="auto"/>
+        <w:ind w:left="745" w:hanging="360"/>
+        <w:rPr>
+          <w:rFonts w:ascii="Calibri Light" w:eastAsia="Calibri" w:hAnsi="Calibri Light" w:cs="Calibri Light"/>
+          <w:color w:val="000000"/>
+          <w:highlight w:val="yellow"/>
+        </w:rPr>
+        <w:tabs>
+          <w:tab w:val="left" w:pos="1800"/>
+          <w:tab w:val="left" w:pos="1980"/>
+        </w:tabs>
+      </w:pPr>
+      <w:r>
+        <w:t>E-mail</w:t>
+        <w:tab/>
+        <w:t>:</w:t>
+        <w:tab/>
+        <w:t>{{PIHAK_KEDUA_EMAIL}}</w:t>
+      </w:r>
+    </w:p>
+    <w:p>
+      <w:pPr>
+        <w:pBdr>
+          <w:top w:val="nil"/>
+          <w:left w:val="nil"/>
+          <w:bottom w:val="nil"/>
+          <w:right w:val="nil"/>
+          <w:between w:val="nil"/>
+        </w:pBdr>
+        <w:spacing w:line="276" w:lineRule="auto"/>
+        <w:ind w:left="745" w:hanging="360"/>
+        <w:rPr>
+          <w:rFonts w:ascii="Calibri Light" w:eastAsia="Calibri" w:hAnsi="Calibri Light" w:cs="Calibri Light"/>
+          <w:color w:val="000000"/>
+        </w:rPr>
+        <w:tabs>
+          <w:tab w:val="left" w:pos="1800"/>
+          <w:tab w:val="left" w:pos="1980"/>
+        </w:tabs>
+      </w:pPr>
+      <w:r>
+        <w:t>PIC</w:t>
+        <w:tab/>
+        <w:t>:</w:t>
+        <w:tab/>
+        <w:t>{{PIHAK_KEDUA_PIC}}</w:t>
+      </w:r>
+    </w:p>
+    <w:p>
+      <w:pPr>
+        <w:pageBreakBefore/>
         <w:spacing w:line="276" w:lineRule="auto"/>
         <w:jc w:val="center"/>
         <w:rPr>
@@ -12047,6 +11385,9 @@
           <w:rFonts w:ascii="Calibri Light" w:eastAsia="Calibri" w:hAnsi="Calibri Light" w:cs="Calibri Light"/>
         </w:rPr>
       </w:pPr>
+      <w:r>
+        <w:t>{{DAFTAR_LAMPIRAN}}</w:t>
+      </w:r>
     </w:p>
     <w:p>
       <w:pPr>
@@ -12373,43 +11714,6 @@
         <w:color w:val="000000"/>
       </w:rPr>
     </w:pPr>
-    <w:r>
-      <w:rPr>
-        <w:rFonts w:eastAsia="Arial"/>
-        <w:color w:val="000000"/>
-      </w:rPr>
-      <w:pict w14:anchorId="650587C2">
-        <v:shapetype id="_x0000_t136" coordsize="21600,21600" o:spt="136" adj="10800" path="m@7,l@8,m@5,21600l@6,21600e">
-          <v:formulas>
-            <v:f eqn="sum #0 0 10800"/>
-            <v:f eqn="prod #0 2 1"/>
-            <v:f eqn="sum 21600 0 @1"/>
-            <v:f eqn="sum 0 0 @2"/>
-            <v:f eqn="sum 21600 0 @3"/>
-            <v:f eqn="if @0 @3 0"/>
-            <v:f eqn="if @0 21600 @1"/>
-            <v:f eqn="if @0 0 @2"/>
-            <v:f eqn="if @0 @4 21600"/>
-            <v:f eqn="mid @5 @6"/>
-            <v:f eqn="mid @8 @5"/>
-            <v:f eqn="mid @7 @8"/>
-            <v:f eqn="mid @6 @7"/>
-            <v:f eqn="sum @6 0 @5"/>
-          </v:formulas>
-          <v:path textpathok="t" o:connecttype="custom" o:connectlocs="@9,0;@10,10800;@11,21600;@12,10800" o:connectangles="270,180,90,0"/>
-          <v:textpath on="t" fitshape="t"/>
-          <v:handles>
-            <v:h position="#0,bottomRight" xrange="6629,14971"/>
-          </v:handles>
-          <o:lock v:ext="edit" text="t" shapetype="t"/>
-        </v:shapetype>
-        <v:shape id="PowerPlusWaterMarkObject1" o:spid="_x0000_s1025" type="#_x0000_t136" style="position:absolute;margin-left:0;margin-top:0;width:412.4pt;height:247.45pt;rotation:315;z-index:-251658752;visibility:visible;mso-position-horizontal:center;mso-position-horizontal-relative:margin;mso-position-vertical:center;mso-position-vertical-relative:margin" fillcolor="silver" stroked="f">
-          <v:fill opacity=".5"/>
-          <v:textpath style="font-family:&quot;&amp;quot&quot;;font-size:1pt" string="DRAFT"/>
-          <w10:wrap anchorx="margin" anchory="margin"/>
-        </v:shape>
-      </w:pict>
-    </w:r>
   </w:p>
 </w:hdr>
 </file>

</xml_diff>

<commit_message>
feat: template PKS bawaan memakai termin berulang dan ruang lingkup per poin
</commit_message>
<xml_diff>
--- a/backend/internal/assets/templates/pks-template/Draft-PKS-RIU.docx
+++ b/backend/internal/assets/templates/pks-template/Draft-PKS-RIU.docx
@@ -10385,7 +10385,7 @@
         </w:rPr>
       </w:pPr>
       <w:r>
-        <w:t>{{RUANG_LINGKUP_LIST}}</w:t>
+        <w:t>{{RUANG_LINGKUP}}</w:t>
       </w:r>
     </w:p>
     <w:p>
@@ -10617,7 +10617,7 @@
           <w:color w:val="000000"/>
           <w:highlight w:val="yellow"/>
         </w:rPr>
-        <w:t>2 (dua) termin</w:t>
+        <w:t>{{TERMIN_JUMLAH}} termin</w:t>
       </w:r>
       <w:r>
         <w:rPr>
@@ -10653,7 +10653,7 @@
           <w:rFonts w:ascii="Calibri Light" w:eastAsia="Calibri" w:hAnsi="Calibri Light" w:cs="Calibri Light"/>
           <w:color w:val="000000"/>
         </w:rPr>
-        <w:t xml:space="preserve">Termin pertama: Pembayaran sebesar {{TERMIN_1_PERSEN}}% ({{TERMIN_1_PERSEN_TERBILANG}} persen) dari Nilai Kontrak atau sebesar {{TERMIN_1_NILAI}} ({{TERMIN_1_NILAI_TERBILANG}} rupiah)</w:t>
+        <w:t xml:space="preserve">Termin {{TERMIN_URUTAN}}: Pembayaran sebesar {{TERMIN_PERSEN}}% ({{TERMIN_PERSEN_TERBILANG}} persen) dari Nilai Kontrak atau sebesar {{TERMIN_NILAI}} ({{TERMIN_NILAI_TERBILANG}} rupiah)</w:t>
       </w:r>
       <w:r>
         <w:rPr>
@@ -10676,7 +10676,7 @@
           <w:rFonts w:ascii="Calibri Light" w:eastAsia="Calibri" w:hAnsi="Calibri Light" w:cs="Calibri Light"/>
           <w:color w:val="000000"/>
         </w:rPr>
-        <w:t>yang akan dibayarkan setelah Perjanjian ini ditandatangani oleh PARA PIHAK</w:t>
+        <w:t>yang akan dibayarkan {{TERMIN_SYARAT}}</w:t>
       </w:r>
       <w:bookmarkEnd w:id="1"/>
       <w:r>
@@ -10685,50 +10685,6 @@
           <w:color w:val="000000"/>
         </w:rPr>
         <w:t>.</w:t>
-      </w:r>
-    </w:p>
-    <w:p>
-      <w:pPr>
-        <w:numPr>
-          <w:ilvl w:val="0"/>
-          <w:numId w:val="29"/>
-        </w:numPr>
-        <w:pBdr>
-          <w:top w:val="nil"/>
-          <w:left w:val="nil"/>
-          <w:bottom w:val="nil"/>
-          <w:right w:val="nil"/>
-          <w:between w:val="nil"/>
-        </w:pBdr>
-        <w:spacing w:line="276" w:lineRule="auto"/>
-        <w:ind w:right="4"/>
-        <w:jc w:val="both"/>
-        <w:rPr>
-          <w:rFonts w:ascii="Calibri Light" w:eastAsia="Calibri" w:hAnsi="Calibri Light" w:cs="Calibri Light"/>
-          <w:color w:val="000000"/>
-        </w:rPr>
-      </w:pPr>
-      <w:r>
-        <w:rPr>
-          <w:rFonts w:ascii="Calibri Light" w:eastAsia="Calibri" w:hAnsi="Calibri Light" w:cs="Calibri Light"/>
-          <w:color w:val="000000"/>
-        </w:rPr>
-        <w:t xml:space="preserve">Termin kedua: Pembayaran sebesar {{TERMIN_2_PERSEN}}% ({{TERMIN_2_PERSEN_TERBILANG}} persen) dari Nilai Kontrak atau sebesar {{TERMIN_2_NILAI}} ({{TERMIN_2_NILAI_TERBILANG}} rupiah)</w:t>
-      </w:r>
-      <w:r>
-        <w:rPr>
-          <w:rFonts w:ascii="Calibri Light" w:eastAsia="Calibri" w:hAnsi="Calibri Light" w:cs="Calibri Light"/>
-          <w:color w:val="000000"/>
-          <w:highlight w:val="yellow"/>
-        </w:rPr>
-        <w:t/>
-      </w:r>
-      <w:r>
-        <w:rPr>
-          <w:rFonts w:ascii="Calibri Light" w:eastAsia="Calibri" w:hAnsi="Calibri Light" w:cs="Calibri Light"/>
-          <w:color w:val="000000"/>
-        </w:rPr>
-        <w:t xml:space="preserve"> sudah termasuk pajak yang berlaku, yang akan dibayarkan setelah penyampaian Hasil Laporan Pekerjaan dan Berita Acara Serah Terima Pekerjaan disetujui oleh PIHAK PERTAMA dan ditandatangani oleh PARA PIHAK.</w:t>
       </w:r>
     </w:p>
     <w:p>

</xml_diff>